<commit_message>
Se corrigen la reportería y bitacora de actividades
</commit_message>
<xml_diff>
--- a/Casos de Uso/CU-12-Bitacora_de_Actividades.docx
+++ b/Casos de Uso/CU-12-Bitacora_de_Actividades.docx
@@ -1,10 +1,10 @@
 
 <file path=word/document.xml><?xml version="1.0" encoding="utf-8"?>
-<w:document xmlns:wpc="http://schemas.microsoft.com/office/word/2010/wordprocessingCanvas" xmlns:cx="http://schemas.microsoft.com/office/drawing/2014/chartex" xmlns:cx1="http://schemas.microsoft.com/office/drawing/2015/9/8/chartex" xmlns:cx2="http://schemas.microsoft.com/office/drawing/2015/10/21/chartex" xmlns:cx3="http://schemas.microsoft.com/office/drawing/2016/5/9/chartex" xmlns:cx4="http://schemas.microsoft.com/office/drawing/2016/5/10/chartex" xmlns:cx5="http://schemas.microsoft.com/office/drawing/2016/5/11/chartex" xmlns:cx6="http://schemas.microsoft.com/office/drawing/2016/5/12/chartex" xmlns:cx7="http://schemas.microsoft.com/office/drawing/2016/5/13/chartex" xmlns:cx8="http://schemas.microsoft.com/office/drawing/2016/5/14/chartex" xmlns:mc="http://schemas.openxmlformats.org/markup-compatibility/2006" xmlns:aink="http://schemas.microsoft.com/office/drawing/2016/ink" xmlns:am3d="http://schemas.microsoft.com/office/drawing/2017/model3d" xmlns:o="urn:schemas-microsoft-com:office:office" xmlns:oel="http://schemas.microsoft.com/office/2019/extlst" xmlns:r="http://schemas.openxmlformats.org/officeDocument/2006/relationships" xmlns:m="http://schemas.openxmlformats.org/officeDocument/2006/math" xmlns:v="urn:schemas-microsoft-com:vml" xmlns:wp14="http://schemas.microsoft.com/office/word/2010/wordprocessingDrawing" xmlns:wp="http://schemas.openxmlformats.org/drawingml/2006/wordprocessingDrawing" xmlns:w10="urn:schemas-microsoft-com:office:word" xmlns:w="http://schemas.openxmlformats.org/wordprocessingml/2006/main" xmlns:w14="http://schemas.microsoft.com/office/word/2010/wordml" xmlns:w15="http://schemas.microsoft.com/office/word/2012/wordml" xmlns:w16cex="http://schemas.microsoft.com/office/word/2018/wordml/cex" xmlns:w16cid="http://schemas.microsoft.com/office/word/2016/wordml/cid" xmlns:w16="http://schemas.microsoft.com/office/word/2018/wordml" xmlns:w16du="http://schemas.microsoft.com/office/word/2023/wordml/word16du" xmlns:w16sdtdh="http://schemas.microsoft.com/office/word/2020/wordml/sdtdatahash" xmlns:w16sdtfl="http://schemas.microsoft.com/office/word/2024/wordml/sdtformatlock" xmlns:w16se="http://schemas.microsoft.com/office/word/2015/wordml/symex" xmlns:wpg="http://schemas.microsoft.com/office/word/2010/wordprocessingGroup" xmlns:wpi="http://schemas.microsoft.com/office/word/2010/wordprocessingInk" xmlns:wne="http://schemas.microsoft.com/office/word/2006/wordml" xmlns:wps="http://schemas.microsoft.com/office/word/2010/wordprocessingShape" mc:Ignorable="w14 w15 w16se w16cid w16 w16cex w16sdtdh w16sdtfl w16du wp14">
+<w:document xmlns:wpc="http://schemas.microsoft.com/office/word/2010/wordprocessingCanvas" xmlns:cx="http://schemas.microsoft.com/office/drawing/2014/chartex" xmlns:cx1="http://schemas.microsoft.com/office/drawing/2015/9/8/chartex" xmlns:cx2="http://schemas.microsoft.com/office/drawing/2015/10/21/chartex" xmlns:cx3="http://schemas.microsoft.com/office/drawing/2016/5/9/chartex" xmlns:cx4="http://schemas.microsoft.com/office/drawing/2016/5/10/chartex" xmlns:cx5="http://schemas.microsoft.com/office/drawing/2016/5/11/chartex" xmlns:cx6="http://schemas.microsoft.com/office/drawing/2016/5/12/chartex" xmlns:cx7="http://schemas.microsoft.com/office/drawing/2016/5/13/chartex" xmlns:cx8="http://schemas.microsoft.com/office/drawing/2016/5/14/chartex" xmlns:mc="http://schemas.openxmlformats.org/markup-compatibility/2006" xmlns:aink="http://schemas.microsoft.com/office/drawing/2016/ink" xmlns:am3d="http://schemas.microsoft.com/office/drawing/2017/model3d" xmlns:o="urn:schemas-microsoft-com:office:office" xmlns:r="http://schemas.openxmlformats.org/officeDocument/2006/relationships" xmlns:m="http://schemas.openxmlformats.org/officeDocument/2006/math" xmlns:v="urn:schemas-microsoft-com:vml" xmlns:wp14="http://schemas.microsoft.com/office/word/2010/wordprocessingDrawing" xmlns:wp="http://schemas.openxmlformats.org/drawingml/2006/wordprocessingDrawing" xmlns:w10="urn:schemas-microsoft-com:office:word" xmlns:w="http://schemas.openxmlformats.org/wordprocessingml/2006/main" xmlns:w14="http://schemas.microsoft.com/office/word/2010/wordml" xmlns:w15="http://schemas.microsoft.com/office/word/2012/wordml" xmlns:w16cex="http://schemas.microsoft.com/office/word/2018/wordml/cex" xmlns:w16cid="http://schemas.microsoft.com/office/word/2016/wordml/cid" xmlns:w16="http://schemas.microsoft.com/office/word/2018/wordml" xmlns:w16sdtdh="http://schemas.microsoft.com/office/word/2020/wordml/sdtdatahash" xmlns:w16se="http://schemas.microsoft.com/office/word/2015/wordml/symex" xmlns:wpg="http://schemas.microsoft.com/office/word/2010/wordprocessingGroup" xmlns:wpi="http://schemas.microsoft.com/office/word/2010/wordprocessingInk" xmlns:wne="http://schemas.microsoft.com/office/word/2006/wordml" xmlns:wps="http://schemas.microsoft.com/office/word/2010/wordprocessingShape" mc:Ignorable="w14 w15 w16se w16cid w16 w16cex w16sdtdh wp14">
   <w:body>
     <w:p>
       <w:pPr>
-        <w:pStyle w:val="Ttulo"/>
+        <w:pStyle w:val="Title"/>
         <w:spacing w:before="0" w:after="0"/>
         <w:rPr>
           <w:lang w:val="es-ES"/>
@@ -19,7 +19,7 @@
     </w:p>
     <w:p>
       <w:pPr>
-        <w:pStyle w:val="Ttulo"/>
+        <w:pStyle w:val="Title"/>
         <w:spacing w:before="0" w:after="0"/>
         <w:rPr>
           <w:lang w:val="es-ES"/>
@@ -47,7 +47,7 @@
           <w:szCs w:val="36"/>
           <w:lang w:val="es-ES"/>
         </w:rPr>
-        <w:t xml:space="preserve">CU-15-Bitácora de actividades</w:t>
+        <w:t>CU-15-Bitácora de actividades</w:t>
       </w:r>
     </w:p>
     <w:p>
@@ -354,7 +354,7 @@
                 <w:noProof/>
                 <w:lang w:val="es-GT"/>
               </w:rPr>
-              <w:t xml:space="preserve">grupo 1 Análisis de Sistemas 2</w:t>
+              <w:t>grupo 1 Análisis de Sistemas 2</w:t>
             </w:r>
           </w:p>
         </w:tc>
@@ -379,7 +379,7 @@
                 <w:noProof/>
                 <w:lang w:val="es-GT"/>
               </w:rPr>
-              <w:t xml:space="preserve">06/10/2026</w:t>
+              <w:t>06/10/2026</w:t>
             </w:r>
           </w:p>
         </w:tc>
@@ -404,7 +404,7 @@
                 <w:noProof/>
                 <w:lang w:val="es-GT"/>
               </w:rPr>
-              <w:t xml:space="preserve">Creación del documento</w:t>
+              <w:t>Creación del documento</w:t>
             </w:r>
           </w:p>
         </w:tc>
@@ -430,7 +430,7 @@
                 <w:noProof/>
                 <w:lang w:val="es-GT"/>
               </w:rPr>
-              <w:t xml:space="preserve">1.0</w:t>
+              <w:t>1.0</w:t>
             </w:r>
           </w:p>
         </w:tc>
@@ -458,7 +458,7 @@
                 <w:noProof/>
                 <w:lang w:val="es-GT"/>
               </w:rPr>
-              <w:t xml:space="preserve">grupo 1 Análisis de Sistemas 2</w:t>
+              <w:t>grupo 1 Análisis de Sistemas 2</w:t>
             </w:r>
           </w:p>
         </w:tc>
@@ -483,7 +483,7 @@
                 <w:noProof/>
                 <w:lang w:val="es-GT"/>
               </w:rPr>
-              <w:t xml:space="preserve">13/10/2026</w:t>
+              <w:t>13/10/2026</w:t>
             </w:r>
           </w:p>
         </w:tc>
@@ -508,7 +508,7 @@
                 <w:noProof/>
                 <w:lang w:val="es-GT"/>
               </w:rPr>
-              <w:t xml:space="preserve">Actualización de las referencias a los casos de uso renumerados</w:t>
+              <w:t>Actualización de las referencias a los casos de uso renumerados</w:t>
             </w:r>
           </w:p>
         </w:tc>
@@ -534,7 +534,7 @@
                 <w:noProof/>
                 <w:lang w:val="es-GT"/>
               </w:rPr>
-              <w:t xml:space="preserve">1.0</w:t>
+              <w:t>1.0</w:t>
             </w:r>
           </w:p>
         </w:tc>
@@ -885,7 +885,7 @@
     </w:p>
     <w:p>
       <w:pPr>
-        <w:pStyle w:val="Ttulo1"/>
+        <w:pStyle w:val="Heading1"/>
         <w:numPr>
           <w:ilvl w:val="0"/>
           <w:numId w:val="17"/>
@@ -915,7 +915,7 @@
     </w:p>
     <w:p>
       <w:pPr>
-        <w:pStyle w:val="Ttulo2"/>
+        <w:pStyle w:val="Heading2"/>
         <w:numPr>
           <w:ilvl w:val="1"/>
           <w:numId w:val="17"/>
@@ -949,12 +949,12 @@
           <w:szCs w:val="20"/>
           <w:lang w:val="es-ES_tradnl"/>
         </w:rPr>
-        <w:t xml:space="preserve">Permitir que el Administrador consulte el registro de las actividades del sistema, que reúne los inicios y cierres de sesión, los intentos fallidos y los cambios realizados sobre los casos, los usuarios y los catálogos.</w:t>
-      </w:r>
-    </w:p>
-    <w:p>
-      <w:pPr>
-        <w:pStyle w:val="Ttulo1"/>
+        <w:t>Permitir que el Administrador consulte el registro de las actividades del sistema, que reúne los inicios y cierres de sesión, los intentos fallidos y los cambios realizados sobre los casos, los usuarios y los catálogos.</w:t>
+      </w:r>
+    </w:p>
+    <w:p>
+      <w:pPr>
+        <w:pStyle w:val="Heading1"/>
         <w:numPr>
           <w:ilvl w:val="0"/>
           <w:numId w:val="17"/>
@@ -984,7 +984,7 @@
     </w:p>
     <w:p>
       <w:pPr>
-        <w:pStyle w:val="Ttulo2"/>
+        <w:pStyle w:val="Heading2"/>
         <w:numPr>
           <w:ilvl w:val="1"/>
           <w:numId w:val="17"/>
@@ -1022,7 +1022,7 @@
           <w:szCs w:val="20"/>
           <w:lang w:val="es-ES_tradnl"/>
         </w:rPr>
-        <w:t xml:space="preserve">Sistema web</w:t>
+        <w:t>Sistema web</w:t>
       </w:r>
     </w:p>
     <w:p>
@@ -1043,12 +1043,12 @@
           <w:szCs w:val="20"/>
           <w:lang w:val="es-ES_tradnl"/>
         </w:rPr>
-        <w:t xml:space="preserve">Usuario empleado municipal con rol de Administrador</w:t>
-      </w:r>
-    </w:p>
-    <w:p>
-      <w:pPr>
-        <w:pStyle w:val="Ttulo2"/>
+        <w:t>Usuario empleado municipal con rol de Administrador</w:t>
+      </w:r>
+    </w:p>
+    <w:p>
+      <w:pPr>
+        <w:pStyle w:val="Heading2"/>
         <w:numPr>
           <w:ilvl w:val="1"/>
           <w:numId w:val="17"/>
@@ -1086,7 +1086,7 @@
           <w:szCs w:val="20"/>
           <w:lang w:val="es-ES_tradnl"/>
         </w:rPr>
-        <w:t xml:space="preserve">Que el sistema web se encuentre disponible.</w:t>
+        <w:t>Que el sistema web se encuentre disponible.</w:t>
       </w:r>
     </w:p>
     <w:p>
@@ -1107,12 +1107,12 @@
           <w:szCs w:val="20"/>
           <w:lang w:val="es-ES_tradnl"/>
         </w:rPr>
-        <w:t xml:space="preserve">Que el usuario haya iniciado sesión con el rol de Administrador.</w:t>
-      </w:r>
-    </w:p>
-    <w:p>
-      <w:pPr>
-        <w:pStyle w:val="Ttulo2"/>
+        <w:t>Que el usuario haya iniciado sesión con el rol de Administrador.</w:t>
+      </w:r>
+    </w:p>
+    <w:p>
+      <w:pPr>
+        <w:pStyle w:val="Heading2"/>
         <w:numPr>
           <w:ilvl w:val="1"/>
           <w:numId w:val="17"/>
@@ -1168,7 +1168,7 @@
           <w:szCs w:val="20"/>
           <w:lang w:val="es-ES_tradnl"/>
         </w:rPr>
-        <w:t xml:space="preserve">Ver CU01</w:t>
+        <w:t>Ver CU01</w:t>
       </w:r>
     </w:p>
     <w:p>
@@ -1189,7 +1189,7 @@
           <w:szCs w:val="20"/>
           <w:lang w:val="es-ES_tradnl"/>
         </w:rPr>
-        <w:t xml:space="preserve">El sistema muestra la bandeja principal con los siguientes menús.</w:t>
+        <w:t>El sistema muestra la bandeja principal con los siguientes menús.</w:t>
       </w:r>
     </w:p>
     <w:p>
@@ -1220,7 +1220,7 @@
           <w:szCs w:val="20"/>
           <w:lang w:val="es-ES_tradnl"/>
         </w:rPr>
-        <w:t xml:space="preserve">Ver CU09</w:t>
+        <w:t>Ver CU09</w:t>
       </w:r>
     </w:p>
     <w:p>
@@ -1251,7 +1251,7 @@
           <w:szCs w:val="20"/>
           <w:lang w:val="es-ES_tradnl"/>
         </w:rPr>
-        <w:t xml:space="preserve">Ver CU10</w:t>
+        <w:t>Ver CU10</w:t>
       </w:r>
     </w:p>
     <w:p>
@@ -1272,7 +1272,7 @@
           <w:szCs w:val="20"/>
           <w:lang w:val="es-ES_tradnl"/>
         </w:rPr>
-        <w:t xml:space="preserve">Bitácora de actividades</w:t>
+        <w:t>Bitácora de actividades</w:t>
       </w:r>
     </w:p>
     <w:p>
@@ -1303,7 +1303,7 @@
           <w:szCs w:val="20"/>
           <w:lang w:val="es-ES_tradnl"/>
         </w:rPr>
-        <w:t xml:space="preserve">Ver CU13</w:t>
+        <w:t>Ver CU13</w:t>
       </w:r>
     </w:p>
     <w:p>
@@ -1334,7 +1334,7 @@
           <w:szCs w:val="20"/>
           <w:lang w:val="es-ES_tradnl"/>
         </w:rPr>
-        <w:t xml:space="preserve">Ver CU11</w:t>
+        <w:t>Ver CU11</w:t>
       </w:r>
     </w:p>
     <w:p>
@@ -1365,7 +1365,7 @@
           <w:szCs w:val="20"/>
           <w:lang w:val="es-ES_tradnl"/>
         </w:rPr>
-        <w:t xml:space="preserve">FA07</w:t>
+        <w:t>FA07</w:t>
       </w:r>
     </w:p>
     <w:p>
@@ -1396,7 +1396,7 @@
           <w:szCs w:val="20"/>
           <w:lang w:val="es-ES_tradnl"/>
         </w:rPr>
-        <w:t xml:space="preserve">FA01</w:t>
+        <w:t>FA01</w:t>
       </w:r>
     </w:p>
     <w:p>
@@ -1417,7 +1417,23 @@
           <w:szCs w:val="20"/>
           <w:lang w:val="es-ES_tradnl"/>
         </w:rPr>
-        <w:t xml:space="preserve">El usuario selecciona el menú “Bitácora de actividades”.</w:t>
+        <w:t xml:space="preserve">El usuario selecciona </w:t>
+      </w:r>
+      <w:r>
+        <w:rPr>
+          <w:sz w:val="20"/>
+          <w:szCs w:val="20"/>
+          <w:lang w:val="es-ES_tradnl"/>
+        </w:rPr>
+        <w:t>d</w:t>
+      </w:r>
+      <w:r>
+        <w:rPr>
+          <w:sz w:val="20"/>
+          <w:szCs w:val="20"/>
+          <w:lang w:val="es-ES_tradnl"/>
+        </w:rPr>
+        <w:t>el menú “Bitácora de actividades”.</w:t>
       </w:r>
     </w:p>
     <w:p>
@@ -1448,7 +1464,7 @@
           <w:szCs w:val="20"/>
           <w:lang w:val="es-ES_tradnl"/>
         </w:rPr>
-        <w:t xml:space="preserve">RN34</w:t>
+        <w:t>RN34</w:t>
       </w:r>
     </w:p>
     <w:p>
@@ -1469,7 +1485,7 @@
           <w:szCs w:val="20"/>
           <w:lang w:val="es-ES_tradnl"/>
         </w:rPr>
-        <w:t xml:space="preserve">El sistema muestra los siguientes botones.</w:t>
+        <w:t>El sistema muestra los siguientes botones.</w:t>
       </w:r>
     </w:p>
     <w:p>
@@ -1490,7 +1506,7 @@
           <w:szCs w:val="20"/>
           <w:lang w:val="es-ES_tradnl"/>
         </w:rPr>
-        <w:t xml:space="preserve">Consultar</w:t>
+        <w:t>Consultar</w:t>
       </w:r>
     </w:p>
     <w:p>
@@ -1521,7 +1537,152 @@
           <w:szCs w:val="20"/>
           <w:lang w:val="es-ES_tradnl"/>
         </w:rPr>
-        <w:t xml:space="preserve">FA03</w:t>
+        <w:t>FA03</w:t>
+      </w:r>
+    </w:p>
+    <w:p>
+      <w:pPr>
+        <w:numPr>
+          <w:ilvl w:val="0"/>
+          <w:numId w:val="19"/>
+        </w:numPr>
+        <w:rPr>
+          <w:sz w:val="20"/>
+          <w:szCs w:val="20"/>
+          <w:lang w:val="es-ES_tradnl"/>
+        </w:rPr>
+      </w:pPr>
+      <w:r>
+        <w:rPr>
+          <w:sz w:val="20"/>
+          <w:szCs w:val="20"/>
+          <w:lang w:val="es-ES_tradnl"/>
+        </w:rPr>
+        <w:t>El usuario selecciona los filtros deseados.</w:t>
+      </w:r>
+    </w:p>
+    <w:p>
+      <w:pPr>
+        <w:numPr>
+          <w:ilvl w:val="0"/>
+          <w:numId w:val="19"/>
+        </w:numPr>
+        <w:rPr>
+          <w:sz w:val="20"/>
+          <w:szCs w:val="20"/>
+          <w:lang w:val="es-ES_tradnl"/>
+        </w:rPr>
+      </w:pPr>
+      <w:r>
+        <w:rPr>
+          <w:sz w:val="20"/>
+          <w:szCs w:val="20"/>
+          <w:lang w:val="es-ES_tradnl"/>
+        </w:rPr>
+        <w:t xml:space="preserve">El usuario selecciona el botón “Consultar”. </w:t>
+      </w:r>
+      <w:r>
+        <w:rPr>
+          <w:b/>
+          <w:bCs/>
+          <w:sz w:val="20"/>
+          <w:szCs w:val="20"/>
+          <w:lang w:val="es-ES_tradnl"/>
+        </w:rPr>
+        <w:t>FA02, FA0</w:t>
+      </w:r>
+      <w:r>
+        <w:rPr>
+          <w:b/>
+          <w:bCs/>
+          <w:sz w:val="20"/>
+          <w:szCs w:val="20"/>
+          <w:lang w:val="es-ES_tradnl"/>
+        </w:rPr>
+        <w:t>4</w:t>
+      </w:r>
+    </w:p>
+    <w:p>
+      <w:pPr>
+        <w:numPr>
+          <w:ilvl w:val="0"/>
+          <w:numId w:val="19"/>
+        </w:numPr>
+        <w:rPr>
+          <w:sz w:val="20"/>
+          <w:szCs w:val="20"/>
+          <w:lang w:val="es-ES_tradnl"/>
+        </w:rPr>
+      </w:pPr>
+      <w:r>
+        <w:rPr>
+          <w:sz w:val="20"/>
+          <w:szCs w:val="20"/>
+          <w:lang w:val="es-ES_tradnl"/>
+        </w:rPr>
+        <w:t xml:space="preserve">El sistema muestra el listado de registros con la acción, el usuario, el rol, la entidad afectada, el caso relacionado, la fecha, la hora, la IP de origen, el valor anterior, el valor nuevo y el detalle. </w:t>
+      </w:r>
+      <w:r>
+        <w:rPr>
+          <w:b/>
+          <w:bCs/>
+          <w:sz w:val="20"/>
+          <w:szCs w:val="20"/>
+          <w:lang w:val="es-ES_tradnl"/>
+        </w:rPr>
+        <w:t>RN34</w:t>
+      </w:r>
+    </w:p>
+    <w:p>
+      <w:pPr>
+        <w:numPr>
+          <w:ilvl w:val="0"/>
+          <w:numId w:val="19"/>
+        </w:numPr>
+        <w:rPr>
+          <w:sz w:val="20"/>
+          <w:szCs w:val="20"/>
+          <w:lang w:val="es-ES_tradnl"/>
+        </w:rPr>
+      </w:pPr>
+      <w:r>
+        <w:rPr>
+          <w:sz w:val="20"/>
+          <w:szCs w:val="20"/>
+          <w:lang w:val="es-ES_tradnl"/>
+        </w:rPr>
+        <w:t xml:space="preserve">El sistema muestra los registros paginados, con el total de registros y el total de páginas. </w:t>
+      </w:r>
+      <w:r>
+        <w:rPr>
+          <w:b/>
+          <w:bCs/>
+          <w:sz w:val="20"/>
+          <w:szCs w:val="20"/>
+          <w:lang w:val="es-ES_tradnl"/>
+        </w:rPr>
+        <w:t>RN34</w:t>
+      </w:r>
+    </w:p>
+    <w:p>
+      <w:pPr>
+        <w:numPr>
+          <w:ilvl w:val="0"/>
+          <w:numId w:val="19"/>
+        </w:numPr>
+        <w:rPr>
+          <w:sz w:val="20"/>
+          <w:szCs w:val="20"/>
+          <w:lang w:val="es-ES_tradnl"/>
+        </w:rPr>
+      </w:pPr>
+      <w:r>
+        <w:rPr>
+          <w:sz w:val="20"/>
+          <w:szCs w:val="20"/>
+          <w:lang w:val="es-ES_tradnl"/>
+        </w:rPr>
+        <w:t>El sistema muestra los siguientes botones.</w:t>
       </w:r>
     </w:p>
     <w:p>
@@ -1542,7 +1703,7 @@
           <w:szCs w:val="20"/>
           <w:lang w:val="es-ES_tradnl"/>
         </w:rPr>
-        <w:t xml:space="preserve">Exportar a CSV </w:t>
+        <w:t xml:space="preserve">Anterior </w:t>
       </w:r>
       <w:r>
         <w:rPr>
@@ -1552,7 +1713,58 @@
           <w:szCs w:val="20"/>
           <w:lang w:val="es-ES_tradnl"/>
         </w:rPr>
-        <w:t xml:space="preserve">FA04</w:t>
+        <w:t>FA0</w:t>
+      </w:r>
+      <w:r>
+        <w:rPr>
+          <w:b/>
+          <w:bCs/>
+          <w:sz w:val="20"/>
+          <w:szCs w:val="20"/>
+          <w:lang w:val="es-ES_tradnl"/>
+        </w:rPr>
+        <w:t>5</w:t>
+      </w:r>
+    </w:p>
+    <w:p>
+      <w:pPr>
+        <w:numPr>
+          <w:ilvl w:val="1"/>
+          <w:numId w:val="19"/>
+        </w:numPr>
+        <w:rPr>
+          <w:sz w:val="20"/>
+          <w:szCs w:val="20"/>
+          <w:lang w:val="es-ES_tradnl"/>
+        </w:rPr>
+      </w:pPr>
+      <w:r>
+        <w:rPr>
+          <w:sz w:val="20"/>
+          <w:szCs w:val="20"/>
+          <w:lang w:val="es-ES_tradnl"/>
+        </w:rPr>
+        <w:t xml:space="preserve">Siguiente </w:t>
+      </w:r>
+      <w:r>
+        <w:rPr>
+          <w:b/>
+          <w:bCs/>
+          <w:sz w:val="20"/>
+          <w:szCs w:val="20"/>
+          <w:lang w:val="es-ES_tradnl"/>
+        </w:rPr>
+        <w:t>FA0</w:t>
+      </w:r>
+      <w:r>
+        <w:rPr>
+          <w:b/>
+          <w:bCs/>
+          <w:sz w:val="20"/>
+          <w:szCs w:val="20"/>
+          <w:lang w:val="es-ES_tradnl"/>
+        </w:rPr>
+        <w:t>5</w:t>
       </w:r>
     </w:p>
     <w:p>
@@ -1573,30 +1785,33 @@
           <w:szCs w:val="20"/>
           <w:lang w:val="es-ES_tradnl"/>
         </w:rPr>
-        <w:t xml:space="preserve">El usuario selecciona los filtros deseados.</w:t>
-      </w:r>
-    </w:p>
-    <w:p>
-      <w:pPr>
-        <w:numPr>
-          <w:ilvl w:val="0"/>
-          <w:numId w:val="19"/>
-        </w:numPr>
-        <w:rPr>
-          <w:sz w:val="20"/>
-          <w:szCs w:val="20"/>
-          <w:lang w:val="es-ES_tradnl"/>
-        </w:rPr>
-      </w:pPr>
-      <w:r>
-        <w:rPr>
-          <w:sz w:val="20"/>
-          <w:szCs w:val="20"/>
-          <w:lang w:val="es-ES_tradnl"/>
-        </w:rPr>
-        <w:t xml:space="preserve">El usuario selecciona el botón “Consultar”. </w:t>
-      </w:r>
-      <w:r>
+        <w:t>Fin del caso de uso.</w:t>
+      </w:r>
+    </w:p>
+    <w:p>
+      <w:pPr>
+        <w:pStyle w:val="Heading2"/>
+        <w:numPr>
+          <w:ilvl w:val="1"/>
+          <w:numId w:val="17"/>
+        </w:numPr>
+        <w:rPr>
+          <w:sz w:val="24"/>
+          <w:szCs w:val="24"/>
+          <w:lang w:val="es-ES_tradnl"/>
+        </w:rPr>
+      </w:pPr>
+      <w:r>
+        <w:rPr>
+          <w:sz w:val="24"/>
+          <w:szCs w:val="24"/>
+          <w:lang w:val="es-ES_tradnl"/>
+        </w:rPr>
+        <w:t>Flujos Alternos</w:t>
+      </w:r>
+    </w:p>
+    <w:p>
+      <w:pPr>
         <w:rPr>
           <w:b/>
           <w:bCs/>
@@ -1604,29 +1819,7 @@
           <w:szCs w:val="20"/>
           <w:lang w:val="es-ES_tradnl"/>
         </w:rPr>
-        <w:t xml:space="preserve">FA02, FA05</w:t>
-      </w:r>
-    </w:p>
-    <w:p>
-      <w:pPr>
-        <w:numPr>
-          <w:ilvl w:val="0"/>
-          <w:numId w:val="19"/>
-        </w:numPr>
-        <w:rPr>
-          <w:sz w:val="20"/>
-          <w:szCs w:val="20"/>
-          <w:lang w:val="es-ES_tradnl"/>
-        </w:rPr>
-      </w:pPr>
-      <w:r>
-        <w:rPr>
-          <w:sz w:val="20"/>
-          <w:szCs w:val="20"/>
-          <w:lang w:val="es-ES_tradnl"/>
-        </w:rPr>
-        <w:t xml:space="preserve">El sistema muestra el listado de registros con la acción, el usuario, el rol, la entidad afectada, el caso relacionado, la fecha, la hora, la IP de origen, el valor anterior, el valor nuevo y el detalle. </w:t>
-      </w:r>
+      </w:pPr>
       <w:r>
         <w:rPr>
           <w:b/>
@@ -1635,30 +1828,104 @@
           <w:szCs w:val="20"/>
           <w:lang w:val="es-ES_tradnl"/>
         </w:rPr>
-        <w:t xml:space="preserve">RN34</w:t>
+        <w:t>FA01 Cerrar sesión</w:t>
       </w:r>
     </w:p>
     <w:p>
       <w:pPr>
         <w:numPr>
           <w:ilvl w:val="0"/>
-          <w:numId w:val="19"/>
-        </w:numPr>
-        <w:rPr>
-          <w:sz w:val="20"/>
-          <w:szCs w:val="20"/>
-          <w:lang w:val="es-ES_tradnl"/>
-        </w:rPr>
-      </w:pPr>
-      <w:r>
-        <w:rPr>
-          <w:sz w:val="20"/>
-          <w:szCs w:val="20"/>
-          <w:lang w:val="es-ES_tradnl"/>
-        </w:rPr>
-        <w:t xml:space="preserve">El sistema muestra los registros paginados, con el total de registros y el total de páginas. </w:t>
-      </w:r>
-      <w:r>
+          <w:numId w:val="20"/>
+        </w:numPr>
+        <w:rPr>
+          <w:sz w:val="20"/>
+          <w:szCs w:val="20"/>
+          <w:lang w:val="es-ES_tradnl"/>
+        </w:rPr>
+      </w:pPr>
+      <w:r>
+        <w:rPr>
+          <w:sz w:val="20"/>
+          <w:szCs w:val="20"/>
+          <w:lang w:val="es-ES_tradnl"/>
+        </w:rPr>
+        <w:t>El usuario selecciona el botón “Cerrar sesión”</w:t>
+      </w:r>
+    </w:p>
+    <w:p>
+      <w:pPr>
+        <w:numPr>
+          <w:ilvl w:val="0"/>
+          <w:numId w:val="20"/>
+        </w:numPr>
+        <w:rPr>
+          <w:sz w:val="20"/>
+          <w:szCs w:val="20"/>
+          <w:lang w:val="es-ES_tradnl"/>
+        </w:rPr>
+      </w:pPr>
+      <w:r>
+        <w:rPr>
+          <w:sz w:val="20"/>
+          <w:szCs w:val="20"/>
+          <w:lang w:val="es-ES_tradnl"/>
+        </w:rPr>
+        <w:t>El sistema registra el cierre de sesión en bitácora.</w:t>
+      </w:r>
+    </w:p>
+    <w:p>
+      <w:pPr>
+        <w:numPr>
+          <w:ilvl w:val="0"/>
+          <w:numId w:val="20"/>
+        </w:numPr>
+        <w:rPr>
+          <w:sz w:val="20"/>
+          <w:szCs w:val="20"/>
+          <w:lang w:val="es-ES_tradnl"/>
+        </w:rPr>
+      </w:pPr>
+      <w:r>
+        <w:rPr>
+          <w:sz w:val="20"/>
+          <w:szCs w:val="20"/>
+          <w:lang w:val="es-ES_tradnl"/>
+        </w:rPr>
+        <w:t>El sistema retorna al portal web.</w:t>
+      </w:r>
+    </w:p>
+    <w:p>
+      <w:pPr>
+        <w:numPr>
+          <w:ilvl w:val="0"/>
+          <w:numId w:val="20"/>
+        </w:numPr>
+        <w:rPr>
+          <w:sz w:val="20"/>
+          <w:szCs w:val="20"/>
+          <w:lang w:val="es-ES_tradnl"/>
+        </w:rPr>
+      </w:pPr>
+      <w:r>
+        <w:rPr>
+          <w:sz w:val="20"/>
+          <w:szCs w:val="20"/>
+          <w:lang w:val="es-ES_tradnl"/>
+        </w:rPr>
+        <w:t>Fin de flujo alterno.</w:t>
+      </w:r>
+    </w:p>
+    <w:p>
+      <w:pPr>
+        <w:rPr>
+          <w:sz w:val="20"/>
+          <w:szCs w:val="20"/>
+          <w:lang w:val="es-ES_tradnl"/>
+        </w:rPr>
+      </w:pPr>
+    </w:p>
+    <w:p>
+      <w:pPr>
         <w:rPr>
           <w:b/>
           <w:bCs/>
@@ -1666,50 +1933,7 @@
           <w:szCs w:val="20"/>
           <w:lang w:val="es-ES_tradnl"/>
         </w:rPr>
-        <w:t xml:space="preserve">RN34</w:t>
-      </w:r>
-    </w:p>
-    <w:p>
-      <w:pPr>
-        <w:numPr>
-          <w:ilvl w:val="0"/>
-          <w:numId w:val="19"/>
-        </w:numPr>
-        <w:rPr>
-          <w:sz w:val="20"/>
-          <w:szCs w:val="20"/>
-          <w:lang w:val="es-ES_tradnl"/>
-        </w:rPr>
-      </w:pPr>
-      <w:r>
-        <w:rPr>
-          <w:sz w:val="20"/>
-          <w:szCs w:val="20"/>
-          <w:lang w:val="es-ES_tradnl"/>
-        </w:rPr>
-        <w:t xml:space="preserve">El sistema muestra los siguientes botones.</w:t>
-      </w:r>
-    </w:p>
-    <w:p>
-      <w:pPr>
-        <w:numPr>
-          <w:ilvl w:val="1"/>
-          <w:numId w:val="19"/>
-        </w:numPr>
-        <w:rPr>
-          <w:sz w:val="20"/>
-          <w:szCs w:val="20"/>
-          <w:lang w:val="es-ES_tradnl"/>
-        </w:rPr>
-      </w:pPr>
-      <w:r>
-        <w:rPr>
-          <w:sz w:val="20"/>
-          <w:szCs w:val="20"/>
-          <w:lang w:val="es-ES_tradnl"/>
-        </w:rPr>
-        <w:t xml:space="preserve">Anterior </w:t>
-      </w:r>
+      </w:pPr>
       <w:r>
         <w:rPr>
           <w:b/>
@@ -1718,28 +1942,28 @@
           <w:szCs w:val="20"/>
           <w:lang w:val="es-ES_tradnl"/>
         </w:rPr>
-        <w:t xml:space="preserve">FA06</w:t>
-      </w:r>
-    </w:p>
-    <w:p>
-      <w:pPr>
-        <w:numPr>
-          <w:ilvl w:val="1"/>
-          <w:numId w:val="19"/>
-        </w:numPr>
-        <w:rPr>
-          <w:sz w:val="20"/>
-          <w:szCs w:val="20"/>
-          <w:lang w:val="es-ES_tradnl"/>
-        </w:rPr>
-      </w:pPr>
-      <w:r>
-        <w:rPr>
-          <w:sz w:val="20"/>
-          <w:szCs w:val="20"/>
-          <w:lang w:val="es-ES_tradnl"/>
-        </w:rPr>
-        <w:t xml:space="preserve">Siguiente </w:t>
+        <w:t>FA02 No existen registros para los filtros aplicados</w:t>
+      </w:r>
+    </w:p>
+    <w:p>
+      <w:pPr>
+        <w:numPr>
+          <w:ilvl w:val="0"/>
+          <w:numId w:val="21"/>
+        </w:numPr>
+        <w:rPr>
+          <w:sz w:val="20"/>
+          <w:szCs w:val="20"/>
+          <w:lang w:val="es-ES_tradnl"/>
+        </w:rPr>
+      </w:pPr>
+      <w:r>
+        <w:rPr>
+          <w:sz w:val="20"/>
+          <w:szCs w:val="20"/>
+          <w:lang w:val="es-ES_tradnl"/>
+        </w:rPr>
+        <w:t xml:space="preserve">El sistema muestra el mensaje de error. </w:t>
       </w:r>
       <w:r>
         <w:rPr>
@@ -1749,33 +1973,907 @@
           <w:szCs w:val="20"/>
           <w:lang w:val="es-ES_tradnl"/>
         </w:rPr>
-        <w:t xml:space="preserve">FA06</w:t>
+        <w:t>AN02 # 32</w:t>
       </w:r>
     </w:p>
     <w:p>
       <w:pPr>
         <w:numPr>
           <w:ilvl w:val="0"/>
-          <w:numId w:val="19"/>
-        </w:numPr>
-        <w:rPr>
-          <w:sz w:val="20"/>
-          <w:szCs w:val="20"/>
-          <w:lang w:val="es-ES_tradnl"/>
-        </w:rPr>
-      </w:pPr>
-      <w:r>
-        <w:rPr>
-          <w:sz w:val="20"/>
-          <w:szCs w:val="20"/>
-          <w:lang w:val="es-ES_tradnl"/>
-        </w:rPr>
-        <w:t xml:space="preserve">Fin del caso de uso.</w:t>
-      </w:r>
-    </w:p>
-    <w:p>
-      <w:pPr>
-        <w:pStyle w:val="Ttulo2"/>
+          <w:numId w:val="21"/>
+        </w:numPr>
+        <w:rPr>
+          <w:sz w:val="20"/>
+          <w:szCs w:val="20"/>
+          <w:lang w:val="es-ES_tradnl"/>
+        </w:rPr>
+      </w:pPr>
+      <w:r>
+        <w:rPr>
+          <w:sz w:val="20"/>
+          <w:szCs w:val="20"/>
+          <w:lang w:val="es-ES_tradnl"/>
+        </w:rPr>
+        <w:t>El sistema retorna al paso 6 del flujo básico, para corregir.</w:t>
+      </w:r>
+    </w:p>
+    <w:p>
+      <w:pPr>
+        <w:numPr>
+          <w:ilvl w:val="0"/>
+          <w:numId w:val="21"/>
+        </w:numPr>
+        <w:rPr>
+          <w:sz w:val="20"/>
+          <w:szCs w:val="20"/>
+          <w:lang w:val="es-ES_tradnl"/>
+        </w:rPr>
+      </w:pPr>
+      <w:r>
+        <w:rPr>
+          <w:sz w:val="20"/>
+          <w:szCs w:val="20"/>
+          <w:lang w:val="es-ES_tradnl"/>
+        </w:rPr>
+        <w:t>Fin de flujo alterno.</w:t>
+      </w:r>
+    </w:p>
+    <w:p>
+      <w:pPr>
+        <w:rPr>
+          <w:sz w:val="20"/>
+          <w:szCs w:val="20"/>
+          <w:lang w:val="es-ES_tradnl"/>
+        </w:rPr>
+      </w:pPr>
+    </w:p>
+    <w:p>
+      <w:pPr>
+        <w:rPr>
+          <w:b/>
+          <w:bCs/>
+          <w:sz w:val="20"/>
+          <w:szCs w:val="20"/>
+          <w:lang w:val="es-ES_tradnl"/>
+        </w:rPr>
+      </w:pPr>
+      <w:r>
+        <w:rPr>
+          <w:b/>
+          <w:bCs/>
+          <w:sz w:val="20"/>
+          <w:szCs w:val="20"/>
+          <w:lang w:val="es-ES_tradnl"/>
+        </w:rPr>
+        <w:t>FA03 Limpiar filtros</w:t>
+      </w:r>
+    </w:p>
+    <w:p>
+      <w:pPr>
+        <w:numPr>
+          <w:ilvl w:val="0"/>
+          <w:numId w:val="22"/>
+        </w:numPr>
+        <w:rPr>
+          <w:sz w:val="20"/>
+          <w:szCs w:val="20"/>
+          <w:lang w:val="es-ES_tradnl"/>
+        </w:rPr>
+      </w:pPr>
+      <w:r>
+        <w:rPr>
+          <w:sz w:val="20"/>
+          <w:szCs w:val="20"/>
+          <w:lang w:val="es-ES_tradnl"/>
+        </w:rPr>
+        <w:lastRenderedPageBreak/>
+        <w:t>El usuario selecciona el botón “Limpiar filtros”.</w:t>
+      </w:r>
+    </w:p>
+    <w:p>
+      <w:pPr>
+        <w:numPr>
+          <w:ilvl w:val="0"/>
+          <w:numId w:val="22"/>
+        </w:numPr>
+        <w:rPr>
+          <w:sz w:val="20"/>
+          <w:szCs w:val="20"/>
+          <w:lang w:val="es-ES_tradnl"/>
+        </w:rPr>
+      </w:pPr>
+      <w:r>
+        <w:rPr>
+          <w:sz w:val="20"/>
+          <w:szCs w:val="20"/>
+          <w:lang w:val="es-ES_tradnl"/>
+        </w:rPr>
+        <w:t xml:space="preserve">El sistema quita los filtros de usuario, acción, entidad y rol, y conserva el rango de fechas. </w:t>
+      </w:r>
+      <w:r>
+        <w:rPr>
+          <w:b/>
+          <w:bCs/>
+          <w:sz w:val="20"/>
+          <w:szCs w:val="20"/>
+          <w:lang w:val="es-ES_tradnl"/>
+        </w:rPr>
+        <w:t>RN34</w:t>
+      </w:r>
+    </w:p>
+    <w:p>
+      <w:pPr>
+        <w:numPr>
+          <w:ilvl w:val="0"/>
+          <w:numId w:val="22"/>
+        </w:numPr>
+        <w:rPr>
+          <w:sz w:val="20"/>
+          <w:szCs w:val="20"/>
+          <w:lang w:val="es-ES_tradnl"/>
+        </w:rPr>
+      </w:pPr>
+      <w:r>
+        <w:rPr>
+          <w:sz w:val="20"/>
+          <w:szCs w:val="20"/>
+          <w:lang w:val="es-ES_tradnl"/>
+        </w:rPr>
+        <w:t xml:space="preserve">El sistema retorna al paso </w:t>
+      </w:r>
+      <w:r>
+        <w:rPr>
+          <w:sz w:val="20"/>
+          <w:szCs w:val="20"/>
+          <w:lang w:val="es-ES_tradnl"/>
+        </w:rPr>
+        <w:t>6</w:t>
+      </w:r>
+      <w:r>
+        <w:rPr>
+          <w:sz w:val="20"/>
+          <w:szCs w:val="20"/>
+          <w:lang w:val="es-ES_tradnl"/>
+        </w:rPr>
+        <w:t xml:space="preserve"> del flujo básico.</w:t>
+      </w:r>
+    </w:p>
+    <w:p>
+      <w:pPr>
+        <w:numPr>
+          <w:ilvl w:val="0"/>
+          <w:numId w:val="22"/>
+        </w:numPr>
+        <w:rPr>
+          <w:sz w:val="20"/>
+          <w:szCs w:val="20"/>
+          <w:lang w:val="es-ES_tradnl"/>
+        </w:rPr>
+      </w:pPr>
+      <w:r>
+        <w:rPr>
+          <w:sz w:val="20"/>
+          <w:szCs w:val="20"/>
+          <w:lang w:val="es-ES_tradnl"/>
+        </w:rPr>
+        <w:t>Fin de flujo alterno.</w:t>
+      </w:r>
+    </w:p>
+    <w:p>
+      <w:pPr>
+        <w:rPr>
+          <w:sz w:val="20"/>
+          <w:szCs w:val="20"/>
+          <w:lang w:val="es-ES_tradnl"/>
+        </w:rPr>
+      </w:pPr>
+    </w:p>
+    <w:p>
+      <w:pPr>
+        <w:rPr>
+          <w:b/>
+          <w:bCs/>
+          <w:sz w:val="20"/>
+          <w:szCs w:val="20"/>
+          <w:lang w:val="es-ES_tradnl"/>
+        </w:rPr>
+      </w:pPr>
+      <w:r>
+        <w:rPr>
+          <w:b/>
+          <w:bCs/>
+          <w:sz w:val="20"/>
+          <w:szCs w:val="20"/>
+          <w:lang w:val="es-ES_tradnl"/>
+        </w:rPr>
+        <w:t>FA0</w:t>
+      </w:r>
+      <w:r>
+        <w:rPr>
+          <w:b/>
+          <w:bCs/>
+          <w:sz w:val="20"/>
+          <w:szCs w:val="20"/>
+          <w:lang w:val="es-ES_tradnl"/>
+        </w:rPr>
+        <w:t>4</w:t>
+      </w:r>
+      <w:r>
+        <w:rPr>
+          <w:b/>
+          <w:bCs/>
+          <w:sz w:val="20"/>
+          <w:szCs w:val="20"/>
+          <w:lang w:val="es-ES_tradnl"/>
+        </w:rPr>
+        <w:t xml:space="preserve"> Rango de fechas no válido</w:t>
+      </w:r>
+    </w:p>
+    <w:p>
+      <w:pPr>
+        <w:numPr>
+          <w:ilvl w:val="0"/>
+          <w:numId w:val="26"/>
+        </w:numPr>
+        <w:rPr>
+          <w:sz w:val="20"/>
+          <w:szCs w:val="20"/>
+          <w:lang w:val="es-ES_tradnl"/>
+        </w:rPr>
+      </w:pPr>
+      <w:r>
+        <w:rPr>
+          <w:sz w:val="20"/>
+          <w:szCs w:val="20"/>
+          <w:lang w:val="es-ES_tradnl"/>
+        </w:rPr>
+        <w:t xml:space="preserve">El sistema valida que la fecha final no sea anterior a la inicial. </w:t>
+      </w:r>
+      <w:r>
+        <w:rPr>
+          <w:b/>
+          <w:bCs/>
+          <w:sz w:val="20"/>
+          <w:szCs w:val="20"/>
+          <w:lang w:val="es-ES_tradnl"/>
+        </w:rPr>
+        <w:t>RN34</w:t>
+      </w:r>
+    </w:p>
+    <w:p>
+      <w:pPr>
+        <w:numPr>
+          <w:ilvl w:val="0"/>
+          <w:numId w:val="26"/>
+        </w:numPr>
+        <w:rPr>
+          <w:sz w:val="20"/>
+          <w:szCs w:val="20"/>
+          <w:lang w:val="es-ES_tradnl"/>
+        </w:rPr>
+      </w:pPr>
+      <w:r>
+        <w:rPr>
+          <w:sz w:val="20"/>
+          <w:szCs w:val="20"/>
+          <w:lang w:val="es-ES_tradnl"/>
+        </w:rPr>
+        <w:t xml:space="preserve">El sistema muestra el mensaje de error. </w:t>
+      </w:r>
+      <w:r>
+        <w:rPr>
+          <w:b/>
+          <w:bCs/>
+          <w:sz w:val="20"/>
+          <w:szCs w:val="20"/>
+          <w:lang w:val="es-ES_tradnl"/>
+        </w:rPr>
+        <w:t>AN02 # 30</w:t>
+      </w:r>
+    </w:p>
+    <w:p>
+      <w:pPr>
+        <w:numPr>
+          <w:ilvl w:val="0"/>
+          <w:numId w:val="26"/>
+        </w:numPr>
+        <w:rPr>
+          <w:sz w:val="20"/>
+          <w:szCs w:val="20"/>
+          <w:lang w:val="es-ES_tradnl"/>
+        </w:rPr>
+      </w:pPr>
+      <w:r>
+        <w:rPr>
+          <w:sz w:val="20"/>
+          <w:szCs w:val="20"/>
+          <w:lang w:val="es-ES_tradnl"/>
+        </w:rPr>
+        <w:t>El sistema retorna al paso 6 del flujo básico, para corregir.</w:t>
+      </w:r>
+    </w:p>
+    <w:p>
+      <w:pPr>
+        <w:numPr>
+          <w:ilvl w:val="0"/>
+          <w:numId w:val="26"/>
+        </w:numPr>
+        <w:rPr>
+          <w:sz w:val="20"/>
+          <w:szCs w:val="20"/>
+          <w:lang w:val="es-ES_tradnl"/>
+        </w:rPr>
+      </w:pPr>
+      <w:r>
+        <w:rPr>
+          <w:sz w:val="20"/>
+          <w:szCs w:val="20"/>
+          <w:lang w:val="es-ES_tradnl"/>
+        </w:rPr>
+        <w:t>Fin de flujo alterno.</w:t>
+      </w:r>
+    </w:p>
+    <w:p>
+      <w:pPr>
+        <w:rPr>
+          <w:sz w:val="20"/>
+          <w:szCs w:val="20"/>
+          <w:lang w:val="es-ES_tradnl"/>
+        </w:rPr>
+      </w:pPr>
+    </w:p>
+    <w:p>
+      <w:pPr>
+        <w:rPr>
+          <w:b/>
+          <w:bCs/>
+          <w:sz w:val="20"/>
+          <w:szCs w:val="20"/>
+          <w:lang w:val="es-ES_tradnl"/>
+        </w:rPr>
+      </w:pPr>
+      <w:r>
+        <w:rPr>
+          <w:b/>
+          <w:bCs/>
+          <w:sz w:val="20"/>
+          <w:szCs w:val="20"/>
+          <w:lang w:val="es-ES_tradnl"/>
+        </w:rPr>
+        <w:t>FA0</w:t>
+      </w:r>
+      <w:r>
+        <w:rPr>
+          <w:b/>
+          <w:bCs/>
+          <w:sz w:val="20"/>
+          <w:szCs w:val="20"/>
+          <w:lang w:val="es-ES_tradnl"/>
+        </w:rPr>
+        <w:t>5</w:t>
+      </w:r>
+      <w:r>
+        <w:rPr>
+          <w:b/>
+          <w:bCs/>
+          <w:sz w:val="20"/>
+          <w:szCs w:val="20"/>
+          <w:lang w:val="es-ES_tradnl"/>
+        </w:rPr>
+        <w:t xml:space="preserve"> Cambio de página</w:t>
+      </w:r>
+    </w:p>
+    <w:p>
+      <w:pPr>
+        <w:numPr>
+          <w:ilvl w:val="0"/>
+          <w:numId w:val="27"/>
+        </w:numPr>
+        <w:rPr>
+          <w:sz w:val="20"/>
+          <w:szCs w:val="20"/>
+          <w:lang w:val="es-ES_tradnl"/>
+        </w:rPr>
+      </w:pPr>
+      <w:r>
+        <w:rPr>
+          <w:sz w:val="20"/>
+          <w:szCs w:val="20"/>
+          <w:lang w:val="es-ES_tradnl"/>
+        </w:rPr>
+        <w:t>El usuario selecciona el botón “Anterior” o el botón “Siguiente”.</w:t>
+      </w:r>
+    </w:p>
+    <w:p>
+      <w:pPr>
+        <w:numPr>
+          <w:ilvl w:val="0"/>
+          <w:numId w:val="27"/>
+        </w:numPr>
+        <w:rPr>
+          <w:sz w:val="20"/>
+          <w:szCs w:val="20"/>
+          <w:lang w:val="es-ES_tradnl"/>
+        </w:rPr>
+      </w:pPr>
+      <w:r>
+        <w:rPr>
+          <w:sz w:val="20"/>
+          <w:szCs w:val="20"/>
+          <w:lang w:val="es-ES_tradnl"/>
+        </w:rPr>
+        <w:t xml:space="preserve">El sistema muestra la página solicitada del listado. </w:t>
+      </w:r>
+      <w:r>
+        <w:rPr>
+          <w:b/>
+          <w:bCs/>
+          <w:sz w:val="20"/>
+          <w:szCs w:val="20"/>
+          <w:lang w:val="es-ES_tradnl"/>
+        </w:rPr>
+        <w:t>RN34</w:t>
+      </w:r>
+    </w:p>
+    <w:p>
+      <w:pPr>
+        <w:numPr>
+          <w:ilvl w:val="0"/>
+          <w:numId w:val="27"/>
+        </w:numPr>
+        <w:rPr>
+          <w:sz w:val="20"/>
+          <w:szCs w:val="20"/>
+          <w:lang w:val="es-ES_tradnl"/>
+        </w:rPr>
+      </w:pPr>
+      <w:r>
+        <w:rPr>
+          <w:sz w:val="20"/>
+          <w:szCs w:val="20"/>
+          <w:lang w:val="es-ES_tradnl"/>
+        </w:rPr>
+        <w:t>El sistema retorna al paso 8 del flujo básico.</w:t>
+      </w:r>
+    </w:p>
+    <w:p>
+      <w:pPr>
+        <w:numPr>
+          <w:ilvl w:val="0"/>
+          <w:numId w:val="27"/>
+        </w:numPr>
+        <w:rPr>
+          <w:sz w:val="20"/>
+          <w:szCs w:val="20"/>
+          <w:lang w:val="es-ES_tradnl"/>
+        </w:rPr>
+      </w:pPr>
+      <w:r>
+        <w:rPr>
+          <w:sz w:val="20"/>
+          <w:szCs w:val="20"/>
+          <w:lang w:val="es-ES_tradnl"/>
+        </w:rPr>
+        <w:t>Fin de flujo alterno.</w:t>
+      </w:r>
+    </w:p>
+    <w:p>
+      <w:pPr>
+        <w:rPr>
+          <w:sz w:val="20"/>
+          <w:szCs w:val="20"/>
+          <w:lang w:val="es-ES_tradnl"/>
+        </w:rPr>
+      </w:pPr>
+    </w:p>
+    <w:p>
+      <w:pPr>
+        <w:rPr>
+          <w:b/>
+          <w:bCs/>
+          <w:sz w:val="20"/>
+          <w:szCs w:val="20"/>
+          <w:lang w:val="es-ES_tradnl"/>
+        </w:rPr>
+      </w:pPr>
+      <w:r>
+        <w:rPr>
+          <w:b/>
+          <w:bCs/>
+          <w:sz w:val="20"/>
+          <w:szCs w:val="20"/>
+          <w:lang w:val="es-ES_tradnl"/>
+        </w:rPr>
+        <w:t>FA07 Seguimiento del caso</w:t>
+      </w:r>
+    </w:p>
+    <w:p>
+      <w:pPr>
+        <w:numPr>
+          <w:ilvl w:val="0"/>
+          <w:numId w:val="28"/>
+        </w:numPr>
+        <w:rPr>
+          <w:sz w:val="20"/>
+          <w:szCs w:val="20"/>
+          <w:lang w:val="es-ES_tradnl"/>
+        </w:rPr>
+      </w:pPr>
+      <w:r>
+        <w:rPr>
+          <w:sz w:val="20"/>
+          <w:szCs w:val="20"/>
+          <w:lang w:val="es-ES_tradnl"/>
+        </w:rPr>
+        <w:t>El usuario selecciona el menú “Seguimiento del Caso”.</w:t>
+      </w:r>
+    </w:p>
+    <w:p>
+      <w:pPr>
+        <w:numPr>
+          <w:ilvl w:val="0"/>
+          <w:numId w:val="28"/>
+        </w:numPr>
+        <w:rPr>
+          <w:sz w:val="20"/>
+          <w:szCs w:val="20"/>
+          <w:lang w:val="es-ES_tradnl"/>
+        </w:rPr>
+      </w:pPr>
+      <w:r>
+        <w:rPr>
+          <w:sz w:val="20"/>
+          <w:szCs w:val="20"/>
+          <w:lang w:val="es-ES_tradnl"/>
+        </w:rPr>
+        <w:t>El usuario ingresa el código de seguimiento del caso</w:t>
+      </w:r>
+    </w:p>
+    <w:p>
+      <w:pPr>
+        <w:numPr>
+          <w:ilvl w:val="0"/>
+          <w:numId w:val="28"/>
+        </w:numPr>
+        <w:rPr>
+          <w:sz w:val="20"/>
+          <w:szCs w:val="20"/>
+          <w:lang w:val="es-ES_tradnl"/>
+        </w:rPr>
+      </w:pPr>
+      <w:r>
+        <w:rPr>
+          <w:sz w:val="20"/>
+          <w:szCs w:val="20"/>
+          <w:lang w:val="es-ES_tradnl"/>
+        </w:rPr>
+        <w:t>El usuario selecciona el botón “Buscar”</w:t>
+      </w:r>
+    </w:p>
+    <w:p>
+      <w:pPr>
+        <w:numPr>
+          <w:ilvl w:val="0"/>
+          <w:numId w:val="28"/>
+        </w:numPr>
+        <w:rPr>
+          <w:sz w:val="20"/>
+          <w:szCs w:val="20"/>
+          <w:lang w:val="es-ES_tradnl"/>
+        </w:rPr>
+      </w:pPr>
+      <w:r>
+        <w:rPr>
+          <w:sz w:val="20"/>
+          <w:szCs w:val="20"/>
+          <w:lang w:val="es-ES_tradnl"/>
+        </w:rPr>
+        <w:t xml:space="preserve">El sistema muestra </w:t>
+      </w:r>
+      <w:r>
+        <w:rPr>
+          <w:sz w:val="20"/>
+          <w:szCs w:val="20"/>
+          <w:lang w:val="es-ES_tradnl"/>
+        </w:rPr>
+        <w:t>la información</w:t>
+      </w:r>
+      <w:r>
+        <w:rPr>
+          <w:sz w:val="20"/>
+          <w:szCs w:val="20"/>
+          <w:lang w:val="es-ES_tradnl"/>
+        </w:rPr>
+        <w:t xml:space="preserve"> </w:t>
+      </w:r>
+      <w:r>
+        <w:rPr>
+          <w:sz w:val="20"/>
+          <w:szCs w:val="20"/>
+          <w:lang w:val="es-ES_tradnl"/>
+        </w:rPr>
+        <w:t xml:space="preserve">del </w:t>
+      </w:r>
+      <w:r>
+        <w:rPr>
+          <w:sz w:val="20"/>
+          <w:szCs w:val="20"/>
+          <w:lang w:val="es-ES_tradnl"/>
+        </w:rPr>
+        <w:t xml:space="preserve">seguimiento del caso. </w:t>
+      </w:r>
+      <w:r>
+        <w:rPr>
+          <w:b/>
+          <w:bCs/>
+          <w:sz w:val="20"/>
+          <w:szCs w:val="20"/>
+          <w:lang w:val="es-ES_tradnl"/>
+        </w:rPr>
+        <w:t>RN37</w:t>
+      </w:r>
+    </w:p>
+    <w:p>
+      <w:pPr>
+        <w:numPr>
+          <w:ilvl w:val="0"/>
+          <w:numId w:val="28"/>
+        </w:numPr>
+        <w:rPr>
+          <w:sz w:val="20"/>
+          <w:szCs w:val="20"/>
+          <w:lang w:val="es-ES_tradnl"/>
+        </w:rPr>
+      </w:pPr>
+      <w:r>
+        <w:rPr>
+          <w:sz w:val="20"/>
+          <w:szCs w:val="20"/>
+          <w:lang w:val="es-ES_tradnl"/>
+        </w:rPr>
+        <w:t xml:space="preserve">El sistema muestra el expediente consolidado del caso: sus datos, la decisión del Auxiliar, las observaciones registradas, las actividades del Técnico, los documentos generados y el historial de cambios. </w:t>
+      </w:r>
+      <w:r>
+        <w:rPr>
+          <w:b/>
+          <w:bCs/>
+          <w:sz w:val="20"/>
+          <w:szCs w:val="20"/>
+          <w:lang w:val="es-ES_tradnl"/>
+        </w:rPr>
+        <w:t>RN37</w:t>
+      </w:r>
+      <w:r>
+        <w:rPr>
+          <w:b/>
+          <w:bCs/>
+          <w:sz w:val="20"/>
+          <w:szCs w:val="20"/>
+          <w:lang w:val="es-ES_tradnl"/>
+        </w:rPr>
+        <w:t xml:space="preserve">, </w:t>
+      </w:r>
+      <w:r>
+        <w:rPr>
+          <w:b/>
+          <w:bCs/>
+          <w:sz w:val="20"/>
+          <w:szCs w:val="20"/>
+          <w:lang w:val="es-ES_tradnl"/>
+        </w:rPr>
+        <w:t>FA08</w:t>
+      </w:r>
+    </w:p>
+    <w:p>
+      <w:pPr>
+        <w:numPr>
+          <w:ilvl w:val="0"/>
+          <w:numId w:val="28"/>
+        </w:numPr>
+        <w:rPr>
+          <w:sz w:val="20"/>
+          <w:szCs w:val="20"/>
+          <w:lang w:val="es-ES_tradnl"/>
+        </w:rPr>
+      </w:pPr>
+      <w:r>
+        <w:rPr>
+          <w:sz w:val="20"/>
+          <w:szCs w:val="20"/>
+          <w:lang w:val="es-ES_tradnl"/>
+        </w:rPr>
+        <w:t>El sistema muestra el expediente en modo de solo lectura, sin permitir modificar ningún dato.</w:t>
+      </w:r>
+    </w:p>
+    <w:p>
+      <w:pPr>
+        <w:numPr>
+          <w:ilvl w:val="0"/>
+          <w:numId w:val="28"/>
+        </w:numPr>
+        <w:rPr>
+          <w:sz w:val="20"/>
+          <w:szCs w:val="20"/>
+          <w:lang w:val="es-ES_tradnl"/>
+        </w:rPr>
+      </w:pPr>
+      <w:r>
+        <w:rPr>
+          <w:sz w:val="20"/>
+          <w:szCs w:val="20"/>
+          <w:lang w:val="es-ES_tradnl"/>
+        </w:rPr>
+        <w:t>El sistema retorna al paso 4 del flujo básico.</w:t>
+      </w:r>
+    </w:p>
+    <w:p>
+      <w:pPr>
+        <w:numPr>
+          <w:ilvl w:val="0"/>
+          <w:numId w:val="28"/>
+        </w:numPr>
+        <w:rPr>
+          <w:sz w:val="20"/>
+          <w:szCs w:val="20"/>
+          <w:lang w:val="es-ES_tradnl"/>
+        </w:rPr>
+      </w:pPr>
+      <w:r>
+        <w:rPr>
+          <w:sz w:val="20"/>
+          <w:szCs w:val="20"/>
+          <w:lang w:val="es-ES_tradnl"/>
+        </w:rPr>
+        <w:t>Fin de flujo alterno.</w:t>
+      </w:r>
+    </w:p>
+    <w:p>
+      <w:pPr>
+        <w:rPr>
+          <w:sz w:val="20"/>
+          <w:szCs w:val="20"/>
+          <w:lang w:val="es-ES_tradnl"/>
+        </w:rPr>
+      </w:pPr>
+    </w:p>
+    <w:p>
+      <w:pPr>
+        <w:rPr>
+          <w:b/>
+          <w:bCs/>
+          <w:sz w:val="20"/>
+          <w:szCs w:val="20"/>
+          <w:lang w:val="es-ES_tradnl"/>
+        </w:rPr>
+      </w:pPr>
+      <w:r>
+        <w:rPr>
+          <w:b/>
+          <w:bCs/>
+          <w:sz w:val="20"/>
+          <w:szCs w:val="20"/>
+          <w:lang w:val="es-ES_tradnl"/>
+        </w:rPr>
+        <w:t>FA0</w:t>
+      </w:r>
+      <w:r>
+        <w:rPr>
+          <w:b/>
+          <w:bCs/>
+          <w:sz w:val="20"/>
+          <w:szCs w:val="20"/>
+          <w:lang w:val="es-ES_tradnl"/>
+        </w:rPr>
+        <w:t>8</w:t>
+      </w:r>
+      <w:r>
+        <w:rPr>
+          <w:b/>
+          <w:bCs/>
+          <w:sz w:val="20"/>
+          <w:szCs w:val="20"/>
+          <w:lang w:val="es-ES_tradnl"/>
+        </w:rPr>
+        <w:t xml:space="preserve"> Caso no encontrado en el seguimiento</w:t>
+      </w:r>
+    </w:p>
+    <w:p>
+      <w:pPr>
+        <w:numPr>
+          <w:ilvl w:val="0"/>
+          <w:numId w:val="29"/>
+        </w:numPr>
+        <w:rPr>
+          <w:sz w:val="20"/>
+          <w:szCs w:val="20"/>
+          <w:lang w:val="es-ES_tradnl"/>
+        </w:rPr>
+      </w:pPr>
+      <w:r>
+        <w:rPr>
+          <w:sz w:val="20"/>
+          <w:szCs w:val="20"/>
+          <w:lang w:val="es-ES_tradnl"/>
+        </w:rPr>
+        <w:t>El sistema valida que exista un caso con el código ingresado.</w:t>
+      </w:r>
+    </w:p>
+    <w:p>
+      <w:pPr>
+        <w:numPr>
+          <w:ilvl w:val="0"/>
+          <w:numId w:val="29"/>
+        </w:numPr>
+        <w:rPr>
+          <w:sz w:val="20"/>
+          <w:szCs w:val="20"/>
+          <w:lang w:val="es-ES_tradnl"/>
+        </w:rPr>
+      </w:pPr>
+      <w:r>
+        <w:rPr>
+          <w:sz w:val="20"/>
+          <w:szCs w:val="20"/>
+          <w:lang w:val="es-ES_tradnl"/>
+        </w:rPr>
+        <w:t xml:space="preserve">El sistema muestra el mensaje de error. </w:t>
+      </w:r>
+      <w:r>
+        <w:rPr>
+          <w:b/>
+          <w:bCs/>
+          <w:sz w:val="20"/>
+          <w:szCs w:val="20"/>
+          <w:lang w:val="es-ES_tradnl"/>
+        </w:rPr>
+        <w:t>AN02 # 24</w:t>
+      </w:r>
+    </w:p>
+    <w:p>
+      <w:pPr>
+        <w:numPr>
+          <w:ilvl w:val="0"/>
+          <w:numId w:val="29"/>
+        </w:numPr>
+        <w:rPr>
+          <w:sz w:val="20"/>
+          <w:szCs w:val="20"/>
+          <w:lang w:val="es-ES_tradnl"/>
+        </w:rPr>
+      </w:pPr>
+      <w:r>
+        <w:rPr>
+          <w:sz w:val="20"/>
+          <w:szCs w:val="20"/>
+          <w:lang w:val="es-ES_tradnl"/>
+        </w:rPr>
+        <w:t>El sistema retorna al paso 3 del flujo alterno FA07, para corregir.</w:t>
+      </w:r>
+    </w:p>
+    <w:p>
+      <w:pPr>
+        <w:numPr>
+          <w:ilvl w:val="0"/>
+          <w:numId w:val="29"/>
+        </w:numPr>
+        <w:rPr>
+          <w:sz w:val="20"/>
+          <w:szCs w:val="20"/>
+          <w:lang w:val="es-ES_tradnl"/>
+        </w:rPr>
+      </w:pPr>
+      <w:r>
+        <w:rPr>
+          <w:sz w:val="20"/>
+          <w:szCs w:val="20"/>
+          <w:lang w:val="es-ES_tradnl"/>
+        </w:rPr>
+        <w:t>Fin de flujo alterno.</w:t>
+      </w:r>
+    </w:p>
+    <w:p>
+      <w:pPr>
+        <w:pStyle w:val="Heading2"/>
         <w:numPr>
           <w:ilvl w:val="1"/>
           <w:numId w:val="17"/>
@@ -1792,1074 +2890,6 @@
           <w:szCs w:val="24"/>
           <w:lang w:val="es-ES_tradnl"/>
         </w:rPr>
-        <w:t>Flujos Alternos</w:t>
-      </w:r>
-    </w:p>
-    <w:p>
-      <w:pPr>
-        <w:rPr>
-          <w:b/>
-          <w:bCs/>
-          <w:sz w:val="20"/>
-          <w:szCs w:val="20"/>
-          <w:lang w:val="es-ES_tradnl"/>
-        </w:rPr>
-      </w:pPr>
-      <w:r>
-        <w:rPr>
-          <w:b/>
-          <w:bCs/>
-          <w:sz w:val="20"/>
-          <w:szCs w:val="20"/>
-          <w:lang w:val="es-ES_tradnl"/>
-        </w:rPr>
-        <w:t xml:space="preserve">FA01 Cerrar sesión</w:t>
-      </w:r>
-    </w:p>
-    <w:p>
-      <w:pPr>
-        <w:numPr>
-          <w:ilvl w:val="0"/>
-          <w:numId w:val="20"/>
-        </w:numPr>
-        <w:rPr>
-          <w:sz w:val="20"/>
-          <w:szCs w:val="20"/>
-          <w:lang w:val="es-ES_tradnl"/>
-        </w:rPr>
-      </w:pPr>
-      <w:r>
-        <w:rPr>
-          <w:sz w:val="20"/>
-          <w:szCs w:val="20"/>
-          <w:lang w:val="es-ES_tradnl"/>
-        </w:rPr>
-        <w:t xml:space="preserve">El usuario selecciona el botón “Cerrar sesión”</w:t>
-      </w:r>
-    </w:p>
-    <w:p>
-      <w:pPr>
-        <w:numPr>
-          <w:ilvl w:val="0"/>
-          <w:numId w:val="20"/>
-        </w:numPr>
-        <w:rPr>
-          <w:sz w:val="20"/>
-          <w:szCs w:val="20"/>
-          <w:lang w:val="es-ES_tradnl"/>
-        </w:rPr>
-      </w:pPr>
-      <w:r>
-        <w:rPr>
-          <w:sz w:val="20"/>
-          <w:szCs w:val="20"/>
-          <w:lang w:val="es-ES_tradnl"/>
-        </w:rPr>
-        <w:t xml:space="preserve">El sistema registra el cierre de sesión en bitácora.</w:t>
-      </w:r>
-    </w:p>
-    <w:p>
-      <w:pPr>
-        <w:numPr>
-          <w:ilvl w:val="0"/>
-          <w:numId w:val="20"/>
-        </w:numPr>
-        <w:rPr>
-          <w:sz w:val="20"/>
-          <w:szCs w:val="20"/>
-          <w:lang w:val="es-ES_tradnl"/>
-        </w:rPr>
-      </w:pPr>
-      <w:r>
-        <w:rPr>
-          <w:sz w:val="20"/>
-          <w:szCs w:val="20"/>
-          <w:lang w:val="es-ES_tradnl"/>
-        </w:rPr>
-        <w:t xml:space="preserve">El sistema retorna al portal web.</w:t>
-      </w:r>
-    </w:p>
-    <w:p>
-      <w:pPr>
-        <w:numPr>
-          <w:ilvl w:val="0"/>
-          <w:numId w:val="20"/>
-        </w:numPr>
-        <w:rPr>
-          <w:sz w:val="20"/>
-          <w:szCs w:val="20"/>
-          <w:lang w:val="es-ES_tradnl"/>
-        </w:rPr>
-      </w:pPr>
-      <w:r>
-        <w:rPr>
-          <w:sz w:val="20"/>
-          <w:szCs w:val="20"/>
-          <w:lang w:val="es-ES_tradnl"/>
-        </w:rPr>
-        <w:t xml:space="preserve">Fin de flujo alterno.</w:t>
-      </w:r>
-    </w:p>
-    <w:p>
-      <w:pPr>
-        <w:rPr>
-          <w:sz w:val="20"/>
-          <w:szCs w:val="20"/>
-          <w:lang w:val="es-ES_tradnl"/>
-        </w:rPr>
-      </w:pPr>
-    </w:p>
-    <w:p>
-      <w:pPr>
-        <w:rPr>
-          <w:b/>
-          <w:bCs/>
-          <w:sz w:val="20"/>
-          <w:szCs w:val="20"/>
-          <w:lang w:val="es-ES_tradnl"/>
-        </w:rPr>
-      </w:pPr>
-      <w:r>
-        <w:rPr>
-          <w:b/>
-          <w:bCs/>
-          <w:sz w:val="20"/>
-          <w:szCs w:val="20"/>
-          <w:lang w:val="es-ES_tradnl"/>
-        </w:rPr>
-        <w:t xml:space="preserve">FA02 No existen registros para los filtros aplicados</w:t>
-      </w:r>
-    </w:p>
-    <w:p>
-      <w:pPr>
-        <w:numPr>
-          <w:ilvl w:val="0"/>
-          <w:numId w:val="21"/>
-        </w:numPr>
-        <w:rPr>
-          <w:sz w:val="20"/>
-          <w:szCs w:val="20"/>
-          <w:lang w:val="es-ES_tradnl"/>
-        </w:rPr>
-      </w:pPr>
-      <w:r>
-        <w:rPr>
-          <w:sz w:val="20"/>
-          <w:szCs w:val="20"/>
-          <w:lang w:val="es-ES_tradnl"/>
-        </w:rPr>
-        <w:t xml:space="preserve">El sistema muestra el mensaje de error. </w:t>
-      </w:r>
-      <w:r>
-        <w:rPr>
-          <w:b/>
-          <w:bCs/>
-          <w:sz w:val="20"/>
-          <w:szCs w:val="20"/>
-          <w:lang w:val="es-ES_tradnl"/>
-        </w:rPr>
-        <w:t xml:space="preserve">AN02 # 32</w:t>
-      </w:r>
-    </w:p>
-    <w:p>
-      <w:pPr>
-        <w:numPr>
-          <w:ilvl w:val="0"/>
-          <w:numId w:val="21"/>
-        </w:numPr>
-        <w:rPr>
-          <w:sz w:val="20"/>
-          <w:szCs w:val="20"/>
-          <w:lang w:val="es-ES_tradnl"/>
-        </w:rPr>
-      </w:pPr>
-      <w:r>
-        <w:rPr>
-          <w:sz w:val="20"/>
-          <w:szCs w:val="20"/>
-          <w:lang w:val="es-ES_tradnl"/>
-        </w:rPr>
-        <w:t xml:space="preserve">El sistema retorna al paso 6 del flujo básico, para corregir.</w:t>
-      </w:r>
-    </w:p>
-    <w:p>
-      <w:pPr>
-        <w:numPr>
-          <w:ilvl w:val="0"/>
-          <w:numId w:val="21"/>
-        </w:numPr>
-        <w:rPr>
-          <w:sz w:val="20"/>
-          <w:szCs w:val="20"/>
-          <w:lang w:val="es-ES_tradnl"/>
-        </w:rPr>
-      </w:pPr>
-      <w:r>
-        <w:rPr>
-          <w:sz w:val="20"/>
-          <w:szCs w:val="20"/>
-          <w:lang w:val="es-ES_tradnl"/>
-        </w:rPr>
-        <w:t xml:space="preserve">Fin de flujo alterno.</w:t>
-      </w:r>
-    </w:p>
-    <w:p>
-      <w:pPr>
-        <w:rPr>
-          <w:sz w:val="20"/>
-          <w:szCs w:val="20"/>
-          <w:lang w:val="es-ES_tradnl"/>
-        </w:rPr>
-      </w:pPr>
-    </w:p>
-    <w:p>
-      <w:pPr>
-        <w:rPr>
-          <w:b/>
-          <w:bCs/>
-          <w:sz w:val="20"/>
-          <w:szCs w:val="20"/>
-          <w:lang w:val="es-ES_tradnl"/>
-        </w:rPr>
-      </w:pPr>
-      <w:r>
-        <w:rPr>
-          <w:b/>
-          <w:bCs/>
-          <w:sz w:val="20"/>
-          <w:szCs w:val="20"/>
-          <w:lang w:val="es-ES_tradnl"/>
-        </w:rPr>
-        <w:t xml:space="preserve">FA03 Limpiar filtros</w:t>
-      </w:r>
-    </w:p>
-    <w:p>
-      <w:pPr>
-        <w:numPr>
-          <w:ilvl w:val="0"/>
-          <w:numId w:val="22"/>
-        </w:numPr>
-        <w:rPr>
-          <w:sz w:val="20"/>
-          <w:szCs w:val="20"/>
-          <w:lang w:val="es-ES_tradnl"/>
-        </w:rPr>
-      </w:pPr>
-      <w:r>
-        <w:rPr>
-          <w:sz w:val="20"/>
-          <w:szCs w:val="20"/>
-          <w:lang w:val="es-ES_tradnl"/>
-        </w:rPr>
-        <w:t xml:space="preserve">El usuario selecciona el botón “Limpiar filtros”.</w:t>
-      </w:r>
-    </w:p>
-    <w:p>
-      <w:pPr>
-        <w:numPr>
-          <w:ilvl w:val="0"/>
-          <w:numId w:val="22"/>
-        </w:numPr>
-        <w:rPr>
-          <w:sz w:val="20"/>
-          <w:szCs w:val="20"/>
-          <w:lang w:val="es-ES_tradnl"/>
-        </w:rPr>
-      </w:pPr>
-      <w:r>
-        <w:rPr>
-          <w:sz w:val="20"/>
-          <w:szCs w:val="20"/>
-          <w:lang w:val="es-ES_tradnl"/>
-        </w:rPr>
-        <w:t xml:space="preserve">El sistema quita los filtros de usuario, acción, entidad y rol, y conserva el rango de fechas. </w:t>
-      </w:r>
-      <w:r>
-        <w:rPr>
-          <w:b/>
-          <w:bCs/>
-          <w:sz w:val="20"/>
-          <w:szCs w:val="20"/>
-          <w:lang w:val="es-ES_tradnl"/>
-        </w:rPr>
-        <w:t xml:space="preserve">RN34</w:t>
-      </w:r>
-    </w:p>
-    <w:p>
-      <w:pPr>
-        <w:numPr>
-          <w:ilvl w:val="0"/>
-          <w:numId w:val="22"/>
-        </w:numPr>
-        <w:rPr>
-          <w:sz w:val="20"/>
-          <w:szCs w:val="20"/>
-          <w:lang w:val="es-ES_tradnl"/>
-        </w:rPr>
-      </w:pPr>
-      <w:r>
-        <w:rPr>
-          <w:sz w:val="20"/>
-          <w:szCs w:val="20"/>
-          <w:lang w:val="es-ES_tradnl"/>
-        </w:rPr>
-        <w:t xml:space="preserve">El sistema retorna al paso 7 del flujo básico.</w:t>
-      </w:r>
-    </w:p>
-    <w:p>
-      <w:pPr>
-        <w:numPr>
-          <w:ilvl w:val="0"/>
-          <w:numId w:val="22"/>
-        </w:numPr>
-        <w:rPr>
-          <w:sz w:val="20"/>
-          <w:szCs w:val="20"/>
-          <w:lang w:val="es-ES_tradnl"/>
-        </w:rPr>
-      </w:pPr>
-      <w:r>
-        <w:rPr>
-          <w:sz w:val="20"/>
-          <w:szCs w:val="20"/>
-          <w:lang w:val="es-ES_tradnl"/>
-        </w:rPr>
-        <w:t xml:space="preserve">Fin de flujo alterno.</w:t>
-      </w:r>
-    </w:p>
-    <w:p>
-      <w:pPr>
-        <w:rPr>
-          <w:sz w:val="20"/>
-          <w:szCs w:val="20"/>
-          <w:lang w:val="es-ES_tradnl"/>
-        </w:rPr>
-      </w:pPr>
-    </w:p>
-    <w:p>
-      <w:pPr>
-        <w:rPr>
-          <w:b/>
-          <w:bCs/>
-          <w:sz w:val="20"/>
-          <w:szCs w:val="20"/>
-          <w:lang w:val="es-ES_tradnl"/>
-        </w:rPr>
-      </w:pPr>
-      <w:r>
-        <w:rPr>
-          <w:b/>
-          <w:bCs/>
-          <w:sz w:val="20"/>
-          <w:szCs w:val="20"/>
-          <w:lang w:val="es-ES_tradnl"/>
-        </w:rPr>
-        <w:t xml:space="preserve">FA04 Exportar el listado a CSV</w:t>
-      </w:r>
-    </w:p>
-    <w:p>
-      <w:pPr>
-        <w:numPr>
-          <w:ilvl w:val="0"/>
-          <w:numId w:val="25"/>
-        </w:numPr>
-        <w:rPr>
-          <w:sz w:val="20"/>
-          <w:szCs w:val="20"/>
-          <w:lang w:val="es-ES_tradnl"/>
-        </w:rPr>
-      </w:pPr>
-      <w:r>
-        <w:rPr>
-          <w:sz w:val="20"/>
-          <w:szCs w:val="20"/>
-          <w:lang w:val="es-ES_tradnl"/>
-        </w:rPr>
-        <w:t xml:space="preserve">El usuario selecciona el botón “Exportar a CSV”.</w:t>
-      </w:r>
-    </w:p>
-    <w:p>
-      <w:pPr>
-        <w:numPr>
-          <w:ilvl w:val="0"/>
-          <w:numId w:val="25"/>
-        </w:numPr>
-        <w:rPr>
-          <w:sz w:val="20"/>
-          <w:szCs w:val="20"/>
-          <w:lang w:val="es-ES_tradnl"/>
-        </w:rPr>
-      </w:pPr>
-      <w:r>
-        <w:rPr>
-          <w:sz w:val="20"/>
-          <w:szCs w:val="20"/>
-          <w:lang w:val="es-ES_tradnl"/>
-        </w:rPr>
-        <w:t xml:space="preserve">El sistema genera el archivo con los registros consultados. </w:t>
-      </w:r>
-      <w:r>
-        <w:rPr>
-          <w:b/>
-          <w:bCs/>
-          <w:sz w:val="20"/>
-          <w:szCs w:val="20"/>
-          <w:lang w:val="es-ES_tradnl"/>
-        </w:rPr>
-        <w:t xml:space="preserve">RN34</w:t>
-      </w:r>
-    </w:p>
-    <w:p>
-      <w:pPr>
-        <w:numPr>
-          <w:ilvl w:val="0"/>
-          <w:numId w:val="25"/>
-        </w:numPr>
-        <w:rPr>
-          <w:sz w:val="20"/>
-          <w:szCs w:val="20"/>
-          <w:lang w:val="es-ES_tradnl"/>
-        </w:rPr>
-      </w:pPr>
-      <w:r>
-        <w:rPr>
-          <w:sz w:val="20"/>
-          <w:szCs w:val="20"/>
-          <w:lang w:val="es-ES_tradnl"/>
-        </w:rPr>
-        <w:t xml:space="preserve">El sistema retorna al paso 8 del flujo básico.</w:t>
-      </w:r>
-    </w:p>
-    <w:p>
-      <w:pPr>
-        <w:numPr>
-          <w:ilvl w:val="0"/>
-          <w:numId w:val="25"/>
-        </w:numPr>
-        <w:rPr>
-          <w:sz w:val="20"/>
-          <w:szCs w:val="20"/>
-          <w:lang w:val="es-ES_tradnl"/>
-        </w:rPr>
-      </w:pPr>
-      <w:r>
-        <w:rPr>
-          <w:sz w:val="20"/>
-          <w:szCs w:val="20"/>
-          <w:lang w:val="es-ES_tradnl"/>
-        </w:rPr>
-        <w:t xml:space="preserve">Fin de flujo alterno.</w:t>
-      </w:r>
-    </w:p>
-    <w:p>
-      <w:pPr>
-        <w:rPr>
-          <w:sz w:val="20"/>
-          <w:szCs w:val="20"/>
-          <w:lang w:val="es-ES_tradnl"/>
-        </w:rPr>
-      </w:pPr>
-    </w:p>
-    <w:p>
-      <w:pPr>
-        <w:rPr>
-          <w:b/>
-          <w:bCs/>
-          <w:sz w:val="20"/>
-          <w:szCs w:val="20"/>
-          <w:lang w:val="es-ES_tradnl"/>
-        </w:rPr>
-      </w:pPr>
-      <w:r>
-        <w:rPr>
-          <w:b/>
-          <w:bCs/>
-          <w:sz w:val="20"/>
-          <w:szCs w:val="20"/>
-          <w:lang w:val="es-ES_tradnl"/>
-        </w:rPr>
-        <w:t xml:space="preserve">FA05 Rango de fechas no válido</w:t>
-      </w:r>
-    </w:p>
-    <w:p>
-      <w:pPr>
-        <w:numPr>
-          <w:ilvl w:val="0"/>
-          <w:numId w:val="26"/>
-        </w:numPr>
-        <w:rPr>
-          <w:sz w:val="20"/>
-          <w:szCs w:val="20"/>
-          <w:lang w:val="es-ES_tradnl"/>
-        </w:rPr>
-      </w:pPr>
-      <w:r>
-        <w:rPr>
-          <w:sz w:val="20"/>
-          <w:szCs w:val="20"/>
-          <w:lang w:val="es-ES_tradnl"/>
-        </w:rPr>
-        <w:t xml:space="preserve">El sistema valida que la fecha final no sea anterior a la inicial. </w:t>
-      </w:r>
-      <w:r>
-        <w:rPr>
-          <w:b/>
-          <w:bCs/>
-          <w:sz w:val="20"/>
-          <w:szCs w:val="20"/>
-          <w:lang w:val="es-ES_tradnl"/>
-        </w:rPr>
-        <w:t xml:space="preserve">RN34</w:t>
-      </w:r>
-    </w:p>
-    <w:p>
-      <w:pPr>
-        <w:numPr>
-          <w:ilvl w:val="0"/>
-          <w:numId w:val="26"/>
-        </w:numPr>
-        <w:rPr>
-          <w:sz w:val="20"/>
-          <w:szCs w:val="20"/>
-          <w:lang w:val="es-ES_tradnl"/>
-        </w:rPr>
-      </w:pPr>
-      <w:r>
-        <w:rPr>
-          <w:sz w:val="20"/>
-          <w:szCs w:val="20"/>
-          <w:lang w:val="es-ES_tradnl"/>
-        </w:rPr>
-        <w:t xml:space="preserve">El sistema muestra el mensaje de error. </w:t>
-      </w:r>
-      <w:r>
-        <w:rPr>
-          <w:b/>
-          <w:bCs/>
-          <w:sz w:val="20"/>
-          <w:szCs w:val="20"/>
-          <w:lang w:val="es-ES_tradnl"/>
-        </w:rPr>
-        <w:t xml:space="preserve">AN02 # 30</w:t>
-      </w:r>
-    </w:p>
-    <w:p>
-      <w:pPr>
-        <w:numPr>
-          <w:ilvl w:val="0"/>
-          <w:numId w:val="26"/>
-        </w:numPr>
-        <w:rPr>
-          <w:sz w:val="20"/>
-          <w:szCs w:val="20"/>
-          <w:lang w:val="es-ES_tradnl"/>
-        </w:rPr>
-      </w:pPr>
-      <w:r>
-        <w:rPr>
-          <w:sz w:val="20"/>
-          <w:szCs w:val="20"/>
-          <w:lang w:val="es-ES_tradnl"/>
-        </w:rPr>
-        <w:t xml:space="preserve">El sistema retorna al paso 6 del flujo básico, para corregir.</w:t>
-      </w:r>
-    </w:p>
-    <w:p>
-      <w:pPr>
-        <w:numPr>
-          <w:ilvl w:val="0"/>
-          <w:numId w:val="26"/>
-        </w:numPr>
-        <w:rPr>
-          <w:sz w:val="20"/>
-          <w:szCs w:val="20"/>
-          <w:lang w:val="es-ES_tradnl"/>
-        </w:rPr>
-      </w:pPr>
-      <w:r>
-        <w:rPr>
-          <w:sz w:val="20"/>
-          <w:szCs w:val="20"/>
-          <w:lang w:val="es-ES_tradnl"/>
-        </w:rPr>
-        <w:t xml:space="preserve">Fin de flujo alterno.</w:t>
-      </w:r>
-    </w:p>
-    <w:p>
-      <w:pPr>
-        <w:rPr>
-          <w:sz w:val="20"/>
-          <w:szCs w:val="20"/>
-          <w:lang w:val="es-ES_tradnl"/>
-        </w:rPr>
-      </w:pPr>
-    </w:p>
-    <w:p>
-      <w:pPr>
-        <w:rPr>
-          <w:b/>
-          <w:bCs/>
-          <w:sz w:val="20"/>
-          <w:szCs w:val="20"/>
-          <w:lang w:val="es-ES_tradnl"/>
-        </w:rPr>
-      </w:pPr>
-      <w:r>
-        <w:rPr>
-          <w:b/>
-          <w:bCs/>
-          <w:sz w:val="20"/>
-          <w:szCs w:val="20"/>
-          <w:lang w:val="es-ES_tradnl"/>
-        </w:rPr>
-        <w:t xml:space="preserve">FA06 Cambio de página</w:t>
-      </w:r>
-    </w:p>
-    <w:p>
-      <w:pPr>
-        <w:numPr>
-          <w:ilvl w:val="0"/>
-          <w:numId w:val="27"/>
-        </w:numPr>
-        <w:rPr>
-          <w:sz w:val="20"/>
-          <w:szCs w:val="20"/>
-          <w:lang w:val="es-ES_tradnl"/>
-        </w:rPr>
-      </w:pPr>
-      <w:r>
-        <w:rPr>
-          <w:sz w:val="20"/>
-          <w:szCs w:val="20"/>
-          <w:lang w:val="es-ES_tradnl"/>
-        </w:rPr>
-        <w:t xml:space="preserve">El usuario selecciona el botón “Anterior” o el botón “Siguiente”.</w:t>
-      </w:r>
-    </w:p>
-    <w:p>
-      <w:pPr>
-        <w:numPr>
-          <w:ilvl w:val="0"/>
-          <w:numId w:val="27"/>
-        </w:numPr>
-        <w:rPr>
-          <w:sz w:val="20"/>
-          <w:szCs w:val="20"/>
-          <w:lang w:val="es-ES_tradnl"/>
-        </w:rPr>
-      </w:pPr>
-      <w:r>
-        <w:rPr>
-          <w:sz w:val="20"/>
-          <w:szCs w:val="20"/>
-          <w:lang w:val="es-ES_tradnl"/>
-        </w:rPr>
-        <w:t xml:space="preserve">El sistema muestra la página solicitada del listado. </w:t>
-      </w:r>
-      <w:r>
-        <w:rPr>
-          <w:b/>
-          <w:bCs/>
-          <w:sz w:val="20"/>
-          <w:szCs w:val="20"/>
-          <w:lang w:val="es-ES_tradnl"/>
-        </w:rPr>
-        <w:t xml:space="preserve">RN34</w:t>
-      </w:r>
-    </w:p>
-    <w:p>
-      <w:pPr>
-        <w:numPr>
-          <w:ilvl w:val="0"/>
-          <w:numId w:val="27"/>
-        </w:numPr>
-        <w:rPr>
-          <w:sz w:val="20"/>
-          <w:szCs w:val="20"/>
-          <w:lang w:val="es-ES_tradnl"/>
-        </w:rPr>
-      </w:pPr>
-      <w:r>
-        <w:rPr>
-          <w:sz w:val="20"/>
-          <w:szCs w:val="20"/>
-          <w:lang w:val="es-ES_tradnl"/>
-        </w:rPr>
-        <w:t xml:space="preserve">El sistema retorna al paso 8 del flujo básico.</w:t>
-      </w:r>
-    </w:p>
-    <w:p>
-      <w:pPr>
-        <w:numPr>
-          <w:ilvl w:val="0"/>
-          <w:numId w:val="27"/>
-        </w:numPr>
-        <w:rPr>
-          <w:sz w:val="20"/>
-          <w:szCs w:val="20"/>
-          <w:lang w:val="es-ES_tradnl"/>
-        </w:rPr>
-      </w:pPr>
-      <w:r>
-        <w:rPr>
-          <w:sz w:val="20"/>
-          <w:szCs w:val="20"/>
-          <w:lang w:val="es-ES_tradnl"/>
-        </w:rPr>
-        <w:t xml:space="preserve">Fin de flujo alterno.</w:t>
-      </w:r>
-    </w:p>
-    <w:p>
-      <w:pPr>
-        <w:rPr>
-          <w:sz w:val="20"/>
-          <w:szCs w:val="20"/>
-          <w:lang w:val="es-ES_tradnl"/>
-        </w:rPr>
-      </w:pPr>
-    </w:p>
-    <w:p>
-      <w:pPr>
-        <w:rPr>
-          <w:b/>
-          <w:bCs/>
-          <w:sz w:val="20"/>
-          <w:szCs w:val="20"/>
-          <w:lang w:val="es-ES_tradnl"/>
-        </w:rPr>
-      </w:pPr>
-      <w:r>
-        <w:rPr>
-          <w:b/>
-          <w:bCs/>
-          <w:sz w:val="20"/>
-          <w:szCs w:val="20"/>
-          <w:lang w:val="es-ES_tradnl"/>
-        </w:rPr>
-        <w:t xml:space="preserve">FA07 Seguimiento del caso</w:t>
-      </w:r>
-    </w:p>
-    <w:p>
-      <w:pPr>
-        <w:numPr>
-          <w:ilvl w:val="0"/>
-          <w:numId w:val="28"/>
-        </w:numPr>
-        <w:rPr>
-          <w:sz w:val="20"/>
-          <w:szCs w:val="20"/>
-          <w:lang w:val="es-ES_tradnl"/>
-        </w:rPr>
-      </w:pPr>
-      <w:r>
-        <w:rPr>
-          <w:sz w:val="20"/>
-          <w:szCs w:val="20"/>
-          <w:lang w:val="es-ES_tradnl"/>
-        </w:rPr>
-        <w:t xml:space="preserve">El usuario selecciona el menú “Seguimiento del Caso”.</w:t>
-      </w:r>
-    </w:p>
-    <w:p>
-      <w:pPr>
-        <w:numPr>
-          <w:ilvl w:val="0"/>
-          <w:numId w:val="28"/>
-        </w:numPr>
-        <w:rPr>
-          <w:sz w:val="20"/>
-          <w:szCs w:val="20"/>
-          <w:lang w:val="es-ES_tradnl"/>
-        </w:rPr>
-      </w:pPr>
-      <w:r>
-        <w:rPr>
-          <w:sz w:val="20"/>
-          <w:szCs w:val="20"/>
-          <w:lang w:val="es-ES_tradnl"/>
-        </w:rPr>
-        <w:t xml:space="preserve">El sistema muestra el formulario seguimiento del caso. </w:t>
-      </w:r>
-      <w:r>
-        <w:rPr>
-          <w:b/>
-          <w:bCs/>
-          <w:sz w:val="20"/>
-          <w:szCs w:val="20"/>
-          <w:lang w:val="es-ES_tradnl"/>
-        </w:rPr>
-        <w:t xml:space="preserve">RN37</w:t>
-      </w:r>
-    </w:p>
-    <w:p>
-      <w:pPr>
-        <w:numPr>
-          <w:ilvl w:val="0"/>
-          <w:numId w:val="28"/>
-        </w:numPr>
-        <w:rPr>
-          <w:sz w:val="20"/>
-          <w:szCs w:val="20"/>
-          <w:lang w:val="es-ES_tradnl"/>
-        </w:rPr>
-      </w:pPr>
-      <w:r>
-        <w:rPr>
-          <w:sz w:val="20"/>
-          <w:szCs w:val="20"/>
-          <w:lang w:val="es-ES_tradnl"/>
-        </w:rPr>
-        <w:t xml:space="preserve">El usuario ingresa el código de seguimiento y selecciona el botón “Buscar”. </w:t>
-      </w:r>
-      <w:r>
-        <w:rPr>
-          <w:b/>
-          <w:bCs/>
-          <w:sz w:val="20"/>
-          <w:szCs w:val="20"/>
-          <w:lang w:val="es-ES_tradnl"/>
-        </w:rPr>
-        <w:t xml:space="preserve">FA07-A</w:t>
-      </w:r>
-    </w:p>
-    <w:p>
-      <w:pPr>
-        <w:numPr>
-          <w:ilvl w:val="0"/>
-          <w:numId w:val="28"/>
-        </w:numPr>
-        <w:rPr>
-          <w:sz w:val="20"/>
-          <w:szCs w:val="20"/>
-          <w:lang w:val="es-ES_tradnl"/>
-        </w:rPr>
-      </w:pPr>
-      <w:r>
-        <w:rPr>
-          <w:sz w:val="20"/>
-          <w:szCs w:val="20"/>
-          <w:lang w:val="es-ES_tradnl"/>
-        </w:rPr>
-        <w:t xml:space="preserve">El sistema muestra el expediente consolidado del caso: sus datos, la decisión del Auxiliar, las observaciones registradas, las actividades del Técnico, los documentos generados y el historial de cambios. </w:t>
-      </w:r>
-      <w:r>
-        <w:rPr>
-          <w:b/>
-          <w:bCs/>
-          <w:sz w:val="20"/>
-          <w:szCs w:val="20"/>
-          <w:lang w:val="es-ES_tradnl"/>
-        </w:rPr>
-        <w:t xml:space="preserve">RN37</w:t>
-      </w:r>
-    </w:p>
-    <w:p>
-      <w:pPr>
-        <w:numPr>
-          <w:ilvl w:val="0"/>
-          <w:numId w:val="28"/>
-        </w:numPr>
-        <w:rPr>
-          <w:sz w:val="20"/>
-          <w:szCs w:val="20"/>
-          <w:lang w:val="es-ES_tradnl"/>
-        </w:rPr>
-      </w:pPr>
-      <w:r>
-        <w:rPr>
-          <w:sz w:val="20"/>
-          <w:szCs w:val="20"/>
-          <w:lang w:val="es-ES_tradnl"/>
-        </w:rPr>
-        <w:t xml:space="preserve">El sistema muestra el expediente en modo de solo lectura, sin permitir modificar ningún dato.</w:t>
-      </w:r>
-    </w:p>
-    <w:p>
-      <w:pPr>
-        <w:numPr>
-          <w:ilvl w:val="0"/>
-          <w:numId w:val="28"/>
-        </w:numPr>
-        <w:rPr>
-          <w:sz w:val="20"/>
-          <w:szCs w:val="20"/>
-          <w:lang w:val="es-ES_tradnl"/>
-        </w:rPr>
-      </w:pPr>
-      <w:r>
-        <w:rPr>
-          <w:sz w:val="20"/>
-          <w:szCs w:val="20"/>
-          <w:lang w:val="es-ES_tradnl"/>
-        </w:rPr>
-        <w:t xml:space="preserve">El sistema retorna al paso 4 del flujo básico.</w:t>
-      </w:r>
-    </w:p>
-    <w:p>
-      <w:pPr>
-        <w:numPr>
-          <w:ilvl w:val="0"/>
-          <w:numId w:val="28"/>
-        </w:numPr>
-        <w:rPr>
-          <w:sz w:val="20"/>
-          <w:szCs w:val="20"/>
-          <w:lang w:val="es-ES_tradnl"/>
-        </w:rPr>
-      </w:pPr>
-      <w:r>
-        <w:rPr>
-          <w:sz w:val="20"/>
-          <w:szCs w:val="20"/>
-          <w:lang w:val="es-ES_tradnl"/>
-        </w:rPr>
-        <w:t xml:space="preserve">Fin de flujo alterno.</w:t>
-      </w:r>
-    </w:p>
-    <w:p>
-      <w:pPr>
-        <w:rPr>
-          <w:sz w:val="20"/>
-          <w:szCs w:val="20"/>
-          <w:lang w:val="es-ES_tradnl"/>
-        </w:rPr>
-      </w:pPr>
-    </w:p>
-    <w:p>
-      <w:pPr>
-        <w:rPr>
-          <w:b/>
-          <w:bCs/>
-          <w:sz w:val="20"/>
-          <w:szCs w:val="20"/>
-          <w:lang w:val="es-ES_tradnl"/>
-        </w:rPr>
-      </w:pPr>
-      <w:r>
-        <w:rPr>
-          <w:b/>
-          <w:bCs/>
-          <w:sz w:val="20"/>
-          <w:szCs w:val="20"/>
-          <w:lang w:val="es-ES_tradnl"/>
-        </w:rPr>
-        <w:t xml:space="preserve">FA07-A Caso no encontrado en el seguimiento</w:t>
-      </w:r>
-    </w:p>
-    <w:p>
-      <w:pPr>
-        <w:numPr>
-          <w:ilvl w:val="0"/>
-          <w:numId w:val="29"/>
-        </w:numPr>
-        <w:rPr>
-          <w:sz w:val="20"/>
-          <w:szCs w:val="20"/>
-          <w:lang w:val="es-ES_tradnl"/>
-        </w:rPr>
-      </w:pPr>
-      <w:r>
-        <w:rPr>
-          <w:sz w:val="20"/>
-          <w:szCs w:val="20"/>
-          <w:lang w:val="es-ES_tradnl"/>
-        </w:rPr>
-        <w:t xml:space="preserve">El sistema valida que exista un caso con el código ingresado.</w:t>
-      </w:r>
-    </w:p>
-    <w:p>
-      <w:pPr>
-        <w:numPr>
-          <w:ilvl w:val="0"/>
-          <w:numId w:val="29"/>
-        </w:numPr>
-        <w:rPr>
-          <w:sz w:val="20"/>
-          <w:szCs w:val="20"/>
-          <w:lang w:val="es-ES_tradnl"/>
-        </w:rPr>
-      </w:pPr>
-      <w:r>
-        <w:rPr>
-          <w:sz w:val="20"/>
-          <w:szCs w:val="20"/>
-          <w:lang w:val="es-ES_tradnl"/>
-        </w:rPr>
-        <w:t xml:space="preserve">El sistema muestra el mensaje de error. </w:t>
-      </w:r>
-      <w:r>
-        <w:rPr>
-          <w:b/>
-          <w:bCs/>
-          <w:sz w:val="20"/>
-          <w:szCs w:val="20"/>
-          <w:lang w:val="es-ES_tradnl"/>
-        </w:rPr>
-        <w:t xml:space="preserve">AN02 # 24</w:t>
-      </w:r>
-    </w:p>
-    <w:p>
-      <w:pPr>
-        <w:numPr>
-          <w:ilvl w:val="0"/>
-          <w:numId w:val="29"/>
-        </w:numPr>
-        <w:rPr>
-          <w:sz w:val="20"/>
-          <w:szCs w:val="20"/>
-          <w:lang w:val="es-ES_tradnl"/>
-        </w:rPr>
-      </w:pPr>
-      <w:r>
-        <w:rPr>
-          <w:sz w:val="20"/>
-          <w:szCs w:val="20"/>
-          <w:lang w:val="es-ES_tradnl"/>
-        </w:rPr>
-        <w:t xml:space="preserve">El sistema retorna al paso 3 del flujo alterno FA07, para corregir.</w:t>
-      </w:r>
-    </w:p>
-    <w:p>
-      <w:pPr>
-        <w:numPr>
-          <w:ilvl w:val="0"/>
-          <w:numId w:val="29"/>
-        </w:numPr>
-        <w:rPr>
-          <w:sz w:val="20"/>
-          <w:szCs w:val="20"/>
-          <w:lang w:val="es-ES_tradnl"/>
-        </w:rPr>
-      </w:pPr>
-      <w:r>
-        <w:rPr>
-          <w:sz w:val="20"/>
-          <w:szCs w:val="20"/>
-          <w:lang w:val="es-ES_tradnl"/>
-        </w:rPr>
-        <w:t xml:space="preserve">Fin de flujo alterno.</w:t>
-      </w:r>
-    </w:p>
-    <w:p>
-      <w:pPr>
-        <w:pStyle w:val="Ttulo2"/>
-        <w:numPr>
-          <w:ilvl w:val="1"/>
-          <w:numId w:val="17"/>
-        </w:numPr>
-        <w:rPr>
-          <w:sz w:val="24"/>
-          <w:szCs w:val="24"/>
-          <w:lang w:val="es-ES_tradnl"/>
-        </w:rPr>
-      </w:pPr>
-      <w:r>
-        <w:rPr>
-          <w:sz w:val="24"/>
-          <w:szCs w:val="24"/>
-          <w:lang w:val="es-ES_tradnl"/>
-        </w:rPr>
-        <w:lastRenderedPageBreak/>
         <w:t>Postcondiciones</w:t>
       </w:r>
     </w:p>
@@ -2879,7 +2909,7 @@
           <w:sz w:val="20"/>
           <w:szCs w:val="20"/>
         </w:rPr>
-        <w:t xml:space="preserve">El Administrador consulta los registros de actividad, sin poder modificarlos ni eliminarlos.</w:t>
+        <w:t>El Administrador consulta los registros de actividad, sin poder modificarlos ni eliminarlos.</w:t>
       </w:r>
     </w:p>
     <w:p>
@@ -2898,12 +2928,12 @@
           <w:sz w:val="20"/>
           <w:szCs w:val="20"/>
         </w:rPr>
-        <w:t xml:space="preserve">La bitácora conserva el registro de cada inicio y cierre de sesión, de cada intento fallido y de cada cambio sobre los casos, los usuarios y los catálogos.</w:t>
-      </w:r>
-    </w:p>
-    <w:p>
-      <w:pPr>
-        <w:pStyle w:val="Ttulo1"/>
+        <w:t>La bitácora conserva el registro de cada inicio y cierre de sesión, de cada intento fallido y de cada cambio sobre los casos, los usuarios y los catálogos.</w:t>
+      </w:r>
+    </w:p>
+    <w:p>
+      <w:pPr>
+        <w:pStyle w:val="Heading1"/>
         <w:numPr>
           <w:ilvl w:val="0"/>
           <w:numId w:val="17"/>
@@ -2955,7 +2985,7 @@
           <w:sz w:val="20"/>
           <w:szCs w:val="20"/>
         </w:rPr>
-        <w:t xml:space="preserve">El registro de la bitácora deberá ser de solo lectura: ningún usuario, incluido el Administrador, puede modificar ni eliminar sus registros.</w:t>
+        <w:t>El registro de la bitácora deberá ser de solo lectura: ningún usuario, incluido el Administrador, puede modificar ni eliminar sus registros.</w:t>
       </w:r>
     </w:p>
     <w:p>
@@ -2974,7 +3004,7 @@
           <w:sz w:val="20"/>
           <w:szCs w:val="20"/>
         </w:rPr>
-        <w:t xml:space="preserve">El registro en bitácora nunca deberá interrumpir ni revertir la operación que lo originó.</w:t>
+        <w:t>El registro en bitácora nunca deberá interrumpir ni revertir la operación que lo originó.</w:t>
       </w:r>
     </w:p>
     <w:p>
@@ -2993,31 +3023,12 @@
           <w:sz w:val="20"/>
           <w:szCs w:val="20"/>
         </w:rPr>
-        <w:t xml:space="preserve">El listado deberá poder exportarse en formato CSV, que puede abrirse con una hoja de cálculo.</w:t>
-      </w:r>
-    </w:p>
-    <w:p>
-      <w:pPr>
-        <w:numPr>
-          <w:ilvl w:val="0"/>
-          <w:numId w:val="24"/>
-        </w:numPr>
-        <w:rPr>
-          <w:sz w:val="20"/>
-          <w:szCs w:val="20"/>
-        </w:rPr>
-      </w:pPr>
-      <w:r>
-        <w:rPr>
-          <w:sz w:val="20"/>
-          <w:szCs w:val="20"/>
-        </w:rPr>
-        <w:t xml:space="preserve">La consulta de la bitácora deberá estar restringida al rol de Administrador.</w:t>
-      </w:r>
-    </w:p>
-    <w:p>
-      <w:pPr>
-        <w:pStyle w:val="Ttulo1"/>
+        <w:t>La consulta de la bitácora deberá estar restringida al rol de Administrador.</w:t>
+      </w:r>
+    </w:p>
+    <w:p>
+      <w:pPr>
+        <w:pStyle w:val="Heading1"/>
         <w:numPr>
           <w:ilvl w:val="0"/>
           <w:numId w:val="17"/>
@@ -3227,6 +3238,7 @@
           </w:tcPr>
           <w:p>
             <w:r>
+              <w:lastRenderedPageBreak/>
               <w:t> </w:t>
             </w:r>
           </w:p>
@@ -3310,7 +3322,7 @@
 </file>
 
 <file path=word/endnotes.xml><?xml version="1.0" encoding="utf-8"?>
-<w:endnotes xmlns:wpc="http://schemas.microsoft.com/office/word/2010/wordprocessingCanvas" xmlns:cx="http://schemas.microsoft.com/office/drawing/2014/chartex" xmlns:cx1="http://schemas.microsoft.com/office/drawing/2015/9/8/chartex" xmlns:cx2="http://schemas.microsoft.com/office/drawing/2015/10/21/chartex" xmlns:cx3="http://schemas.microsoft.com/office/drawing/2016/5/9/chartex" xmlns:cx4="http://schemas.microsoft.com/office/drawing/2016/5/10/chartex" xmlns:cx5="http://schemas.microsoft.com/office/drawing/2016/5/11/chartex" xmlns:cx6="http://schemas.microsoft.com/office/drawing/2016/5/12/chartex" xmlns:cx7="http://schemas.microsoft.com/office/drawing/2016/5/13/chartex" xmlns:cx8="http://schemas.microsoft.com/office/drawing/2016/5/14/chartex" xmlns:mc="http://schemas.openxmlformats.org/markup-compatibility/2006" xmlns:aink="http://schemas.microsoft.com/office/drawing/2016/ink" xmlns:am3d="http://schemas.microsoft.com/office/drawing/2017/model3d" xmlns:o="urn:schemas-microsoft-com:office:office" xmlns:oel="http://schemas.microsoft.com/office/2019/extlst" xmlns:r="http://schemas.openxmlformats.org/officeDocument/2006/relationships" xmlns:m="http://schemas.openxmlformats.org/officeDocument/2006/math" xmlns:v="urn:schemas-microsoft-com:vml" xmlns:wp14="http://schemas.microsoft.com/office/word/2010/wordprocessingDrawing" xmlns:wp="http://schemas.openxmlformats.org/drawingml/2006/wordprocessingDrawing" xmlns:w10="urn:schemas-microsoft-com:office:word" xmlns:w="http://schemas.openxmlformats.org/wordprocessingml/2006/main" xmlns:w14="http://schemas.microsoft.com/office/word/2010/wordml" xmlns:w15="http://schemas.microsoft.com/office/word/2012/wordml" xmlns:w16cex="http://schemas.microsoft.com/office/word/2018/wordml/cex" xmlns:w16cid="http://schemas.microsoft.com/office/word/2016/wordml/cid" xmlns:w16="http://schemas.microsoft.com/office/word/2018/wordml" xmlns:w16du="http://schemas.microsoft.com/office/word/2023/wordml/word16du" xmlns:w16sdtdh="http://schemas.microsoft.com/office/word/2020/wordml/sdtdatahash" xmlns:w16sdtfl="http://schemas.microsoft.com/office/word/2024/wordml/sdtformatlock" xmlns:w16se="http://schemas.microsoft.com/office/word/2015/wordml/symex" xmlns:wpg="http://schemas.microsoft.com/office/word/2010/wordprocessingGroup" xmlns:wpi="http://schemas.microsoft.com/office/word/2010/wordprocessingInk" xmlns:wne="http://schemas.microsoft.com/office/word/2006/wordml" xmlns:wps="http://schemas.microsoft.com/office/word/2010/wordprocessingShape" mc:Ignorable="w14 w15 w16se w16cid w16 w16cex w16sdtdh w16sdtfl w16du wp14">
+<w:endnotes xmlns:wpc="http://schemas.microsoft.com/office/word/2010/wordprocessingCanvas" xmlns:cx="http://schemas.microsoft.com/office/drawing/2014/chartex" xmlns:cx1="http://schemas.microsoft.com/office/drawing/2015/9/8/chartex" xmlns:cx2="http://schemas.microsoft.com/office/drawing/2015/10/21/chartex" xmlns:cx3="http://schemas.microsoft.com/office/drawing/2016/5/9/chartex" xmlns:cx4="http://schemas.microsoft.com/office/drawing/2016/5/10/chartex" xmlns:cx5="http://schemas.microsoft.com/office/drawing/2016/5/11/chartex" xmlns:cx6="http://schemas.microsoft.com/office/drawing/2016/5/12/chartex" xmlns:cx7="http://schemas.microsoft.com/office/drawing/2016/5/13/chartex" xmlns:cx8="http://schemas.microsoft.com/office/drawing/2016/5/14/chartex" xmlns:mc="http://schemas.openxmlformats.org/markup-compatibility/2006" xmlns:aink="http://schemas.microsoft.com/office/drawing/2016/ink" xmlns:am3d="http://schemas.microsoft.com/office/drawing/2017/model3d" xmlns:o="urn:schemas-microsoft-com:office:office" xmlns:r="http://schemas.openxmlformats.org/officeDocument/2006/relationships" xmlns:m="http://schemas.openxmlformats.org/officeDocument/2006/math" xmlns:v="urn:schemas-microsoft-com:vml" xmlns:wp14="http://schemas.microsoft.com/office/word/2010/wordprocessingDrawing" xmlns:wp="http://schemas.openxmlformats.org/drawingml/2006/wordprocessingDrawing" xmlns:w10="urn:schemas-microsoft-com:office:word" xmlns:w="http://schemas.openxmlformats.org/wordprocessingml/2006/main" xmlns:w14="http://schemas.microsoft.com/office/word/2010/wordml" xmlns:w15="http://schemas.microsoft.com/office/word/2012/wordml" xmlns:w16cex="http://schemas.microsoft.com/office/word/2018/wordml/cex" xmlns:w16cid="http://schemas.microsoft.com/office/word/2016/wordml/cid" xmlns:w16="http://schemas.microsoft.com/office/word/2018/wordml" xmlns:w16sdtdh="http://schemas.microsoft.com/office/word/2020/wordml/sdtdatahash" xmlns:w16se="http://schemas.microsoft.com/office/word/2015/wordml/symex" xmlns:wpg="http://schemas.microsoft.com/office/word/2010/wordprocessingGroup" xmlns:wpi="http://schemas.microsoft.com/office/word/2010/wordprocessingInk" xmlns:wne="http://schemas.microsoft.com/office/word/2006/wordml" xmlns:wps="http://schemas.microsoft.com/office/word/2010/wordprocessingShape" mc:Ignorable="w14 w15 w16se w16cid w16 w16cex w16sdtdh wp14">
   <w:endnote w:type="separator" w:id="-1">
     <w:p>
       <w:r>
@@ -3329,7 +3341,7 @@
 </file>
 
 <file path=word/footnotes.xml><?xml version="1.0" encoding="utf-8"?>
-<w:footnotes xmlns:wpc="http://schemas.microsoft.com/office/word/2010/wordprocessingCanvas" xmlns:cx="http://schemas.microsoft.com/office/drawing/2014/chartex" xmlns:cx1="http://schemas.microsoft.com/office/drawing/2015/9/8/chartex" xmlns:cx2="http://schemas.microsoft.com/office/drawing/2015/10/21/chartex" xmlns:cx3="http://schemas.microsoft.com/office/drawing/2016/5/9/chartex" xmlns:cx4="http://schemas.microsoft.com/office/drawing/2016/5/10/chartex" xmlns:cx5="http://schemas.microsoft.com/office/drawing/2016/5/11/chartex" xmlns:cx6="http://schemas.microsoft.com/office/drawing/2016/5/12/chartex" xmlns:cx7="http://schemas.microsoft.com/office/drawing/2016/5/13/chartex" xmlns:cx8="http://schemas.microsoft.com/office/drawing/2016/5/14/chartex" xmlns:mc="http://schemas.openxmlformats.org/markup-compatibility/2006" xmlns:aink="http://schemas.microsoft.com/office/drawing/2016/ink" xmlns:am3d="http://schemas.microsoft.com/office/drawing/2017/model3d" xmlns:o="urn:schemas-microsoft-com:office:office" xmlns:oel="http://schemas.microsoft.com/office/2019/extlst" xmlns:r="http://schemas.openxmlformats.org/officeDocument/2006/relationships" xmlns:m="http://schemas.openxmlformats.org/officeDocument/2006/math" xmlns:v="urn:schemas-microsoft-com:vml" xmlns:wp14="http://schemas.microsoft.com/office/word/2010/wordprocessingDrawing" xmlns:wp="http://schemas.openxmlformats.org/drawingml/2006/wordprocessingDrawing" xmlns:w10="urn:schemas-microsoft-com:office:word" xmlns:w="http://schemas.openxmlformats.org/wordprocessingml/2006/main" xmlns:w14="http://schemas.microsoft.com/office/word/2010/wordml" xmlns:w15="http://schemas.microsoft.com/office/word/2012/wordml" xmlns:w16cex="http://schemas.microsoft.com/office/word/2018/wordml/cex" xmlns:w16cid="http://schemas.microsoft.com/office/word/2016/wordml/cid" xmlns:w16="http://schemas.microsoft.com/office/word/2018/wordml" xmlns:w16du="http://schemas.microsoft.com/office/word/2023/wordml/word16du" xmlns:w16sdtdh="http://schemas.microsoft.com/office/word/2020/wordml/sdtdatahash" xmlns:w16sdtfl="http://schemas.microsoft.com/office/word/2024/wordml/sdtformatlock" xmlns:w16se="http://schemas.microsoft.com/office/word/2015/wordml/symex" xmlns:wpg="http://schemas.microsoft.com/office/word/2010/wordprocessingGroup" xmlns:wpi="http://schemas.microsoft.com/office/word/2010/wordprocessingInk" xmlns:wne="http://schemas.microsoft.com/office/word/2006/wordml" xmlns:wps="http://schemas.microsoft.com/office/word/2010/wordprocessingShape" mc:Ignorable="w14 w15 w16se w16cid w16 w16cex w16sdtdh w16sdtfl w16du wp14">
+<w:footnotes xmlns:wpc="http://schemas.microsoft.com/office/word/2010/wordprocessingCanvas" xmlns:cx="http://schemas.microsoft.com/office/drawing/2014/chartex" xmlns:cx1="http://schemas.microsoft.com/office/drawing/2015/9/8/chartex" xmlns:cx2="http://schemas.microsoft.com/office/drawing/2015/10/21/chartex" xmlns:cx3="http://schemas.microsoft.com/office/drawing/2016/5/9/chartex" xmlns:cx4="http://schemas.microsoft.com/office/drawing/2016/5/10/chartex" xmlns:cx5="http://schemas.microsoft.com/office/drawing/2016/5/11/chartex" xmlns:cx6="http://schemas.microsoft.com/office/drawing/2016/5/12/chartex" xmlns:cx7="http://schemas.microsoft.com/office/drawing/2016/5/13/chartex" xmlns:cx8="http://schemas.microsoft.com/office/drawing/2016/5/14/chartex" xmlns:mc="http://schemas.openxmlformats.org/markup-compatibility/2006" xmlns:aink="http://schemas.microsoft.com/office/drawing/2016/ink" xmlns:am3d="http://schemas.microsoft.com/office/drawing/2017/model3d" xmlns:o="urn:schemas-microsoft-com:office:office" xmlns:r="http://schemas.openxmlformats.org/officeDocument/2006/relationships" xmlns:m="http://schemas.openxmlformats.org/officeDocument/2006/math" xmlns:v="urn:schemas-microsoft-com:vml" xmlns:wp14="http://schemas.microsoft.com/office/word/2010/wordprocessingDrawing" xmlns:wp="http://schemas.openxmlformats.org/drawingml/2006/wordprocessingDrawing" xmlns:w10="urn:schemas-microsoft-com:office:word" xmlns:w="http://schemas.openxmlformats.org/wordprocessingml/2006/main" xmlns:w14="http://schemas.microsoft.com/office/word/2010/wordml" xmlns:w15="http://schemas.microsoft.com/office/word/2012/wordml" xmlns:w16cex="http://schemas.microsoft.com/office/word/2018/wordml/cex" xmlns:w16cid="http://schemas.microsoft.com/office/word/2016/wordml/cid" xmlns:w16="http://schemas.microsoft.com/office/word/2018/wordml" xmlns:w16sdtdh="http://schemas.microsoft.com/office/word/2020/wordml/sdtdatahash" xmlns:w16se="http://schemas.microsoft.com/office/word/2015/wordml/symex" xmlns:wpg="http://schemas.microsoft.com/office/word/2010/wordprocessingGroup" xmlns:wpi="http://schemas.microsoft.com/office/word/2010/wordprocessingInk" xmlns:wne="http://schemas.microsoft.com/office/word/2006/wordml" xmlns:wps="http://schemas.microsoft.com/office/word/2010/wordprocessingShape" mc:Ignorable="w14 w15 w16se w16cid w16 w16cex w16sdtdh wp14">
   <w:footnote w:type="separator" w:id="-1">
     <w:p>
       <w:r>
@@ -3348,7 +3360,7 @@
 </file>
 
 <file path=word/numbering.xml><?xml version="1.0" encoding="utf-8"?>
-<w:numbering xmlns:wpc="http://schemas.microsoft.com/office/word/2010/wordprocessingCanvas" xmlns:cx="http://schemas.microsoft.com/office/drawing/2014/chartex" xmlns:cx1="http://schemas.microsoft.com/office/drawing/2015/9/8/chartex" xmlns:cx2="http://schemas.microsoft.com/office/drawing/2015/10/21/chartex" xmlns:cx3="http://schemas.microsoft.com/office/drawing/2016/5/9/chartex" xmlns:cx4="http://schemas.microsoft.com/office/drawing/2016/5/10/chartex" xmlns:cx5="http://schemas.microsoft.com/office/drawing/2016/5/11/chartex" xmlns:cx6="http://schemas.microsoft.com/office/drawing/2016/5/12/chartex" xmlns:cx7="http://schemas.microsoft.com/office/drawing/2016/5/13/chartex" xmlns:cx8="http://schemas.microsoft.com/office/drawing/2016/5/14/chartex" xmlns:mc="http://schemas.openxmlformats.org/markup-compatibility/2006" xmlns:aink="http://schemas.microsoft.com/office/drawing/2016/ink" xmlns:am3d="http://schemas.microsoft.com/office/drawing/2017/model3d" xmlns:o="urn:schemas-microsoft-com:office:office" xmlns:oel="http://schemas.microsoft.com/office/2019/extlst" xmlns:r="http://schemas.openxmlformats.org/officeDocument/2006/relationships" xmlns:m="http://schemas.openxmlformats.org/officeDocument/2006/math" xmlns:v="urn:schemas-microsoft-com:vml" xmlns:wp14="http://schemas.microsoft.com/office/word/2010/wordprocessingDrawing" xmlns:wp="http://schemas.openxmlformats.org/drawingml/2006/wordprocessingDrawing" xmlns:w10="urn:schemas-microsoft-com:office:word" xmlns:w="http://schemas.openxmlformats.org/wordprocessingml/2006/main" xmlns:w14="http://schemas.microsoft.com/office/word/2010/wordml" xmlns:w15="http://schemas.microsoft.com/office/word/2012/wordml" xmlns:w16cex="http://schemas.microsoft.com/office/word/2018/wordml/cex" xmlns:w16cid="http://schemas.microsoft.com/office/word/2016/wordml/cid" xmlns:w16="http://schemas.microsoft.com/office/word/2018/wordml" xmlns:w16du="http://schemas.microsoft.com/office/word/2023/wordml/word16du" xmlns:w16sdtdh="http://schemas.microsoft.com/office/word/2020/wordml/sdtdatahash" xmlns:w16sdtfl="http://schemas.microsoft.com/office/word/2024/wordml/sdtformatlock" xmlns:w16se="http://schemas.microsoft.com/office/word/2015/wordml/symex" xmlns:wpg="http://schemas.microsoft.com/office/word/2010/wordprocessingGroup" xmlns:wpi="http://schemas.microsoft.com/office/word/2010/wordprocessingInk" xmlns:wne="http://schemas.microsoft.com/office/word/2006/wordml" xmlns:wps="http://schemas.microsoft.com/office/word/2010/wordprocessingShape" mc:Ignorable="w14 w15 w16se w16cid w16 w16cex w16sdtdh w16sdtfl w16du wp14">
+<w:numbering xmlns:wpc="http://schemas.microsoft.com/office/word/2010/wordprocessingCanvas" xmlns:cx="http://schemas.microsoft.com/office/drawing/2014/chartex" xmlns:cx1="http://schemas.microsoft.com/office/drawing/2015/9/8/chartex" xmlns:cx2="http://schemas.microsoft.com/office/drawing/2015/10/21/chartex" xmlns:cx3="http://schemas.microsoft.com/office/drawing/2016/5/9/chartex" xmlns:cx4="http://schemas.microsoft.com/office/drawing/2016/5/10/chartex" xmlns:cx5="http://schemas.microsoft.com/office/drawing/2016/5/11/chartex" xmlns:cx6="http://schemas.microsoft.com/office/drawing/2016/5/12/chartex" xmlns:cx7="http://schemas.microsoft.com/office/drawing/2016/5/13/chartex" xmlns:cx8="http://schemas.microsoft.com/office/drawing/2016/5/14/chartex" xmlns:mc="http://schemas.openxmlformats.org/markup-compatibility/2006" xmlns:aink="http://schemas.microsoft.com/office/drawing/2016/ink" xmlns:am3d="http://schemas.microsoft.com/office/drawing/2017/model3d" xmlns:o="urn:schemas-microsoft-com:office:office" xmlns:r="http://schemas.openxmlformats.org/officeDocument/2006/relationships" xmlns:m="http://schemas.openxmlformats.org/officeDocument/2006/math" xmlns:v="urn:schemas-microsoft-com:vml" xmlns:wp14="http://schemas.microsoft.com/office/word/2010/wordprocessingDrawing" xmlns:wp="http://schemas.openxmlformats.org/drawingml/2006/wordprocessingDrawing" xmlns:w10="urn:schemas-microsoft-com:office:word" xmlns:w="http://schemas.openxmlformats.org/wordprocessingml/2006/main" xmlns:w14="http://schemas.microsoft.com/office/word/2010/wordml" xmlns:w15="http://schemas.microsoft.com/office/word/2012/wordml" xmlns:w16cex="http://schemas.microsoft.com/office/word/2018/wordml/cex" xmlns:w16cid="http://schemas.microsoft.com/office/word/2016/wordml/cid" xmlns:w16="http://schemas.microsoft.com/office/word/2018/wordml" xmlns:w16sdtdh="http://schemas.microsoft.com/office/word/2020/wordml/sdtdatahash" xmlns:w16se="http://schemas.microsoft.com/office/word/2015/wordml/symex" xmlns:wpg="http://schemas.microsoft.com/office/word/2010/wordprocessingGroup" xmlns:wpi="http://schemas.microsoft.com/office/word/2010/wordprocessingInk" xmlns:wne="http://schemas.microsoft.com/office/word/2006/wordml" xmlns:wps="http://schemas.microsoft.com/office/word/2010/wordprocessingShape" mc:Ignorable="w14 w15 w16se w16cid w16 w16cex w16sdtdh wp14">
   <w:abstractNum w:abstractNumId="0" w15:restartNumberingAfterBreak="0">
     <w:nsid w:val="02F81A67"/>
     <w:multiLevelType w:val="multilevel"/>
@@ -4042,6 +4054,92 @@
     </w:lvl>
   </w:abstractNum>
   <w:abstractNum w:abstractNumId="7" w15:restartNumberingAfterBreak="0">
+    <w:nsid w:val="1827B527"/>
+    <w:multiLevelType w:val="hybridMultilevel"/>
+    <w:tmpl w:val="05863FEC"/>
+    <w:lvl w:ilvl="0" w:tplc="100A000F">
+      <w:start w:val="1"/>
+      <w:numFmt w:val="decimal"/>
+      <w:lvlText w:val="%1."/>
+      <w:lvlJc w:val="left"/>
+      <w:pPr>
+        <w:ind w:left="720" w:hanging="360"/>
+      </w:pPr>
+    </w:lvl>
+    <w:lvl w:ilvl="1" w:tplc="100A0019" w:tentative="1">
+      <w:start w:val="1"/>
+      <w:numFmt w:val="lowerLetter"/>
+      <w:lvlText w:val="%2."/>
+      <w:lvlJc w:val="left"/>
+      <w:pPr>
+        <w:ind w:left="1440" w:hanging="360"/>
+      </w:pPr>
+    </w:lvl>
+    <w:lvl w:ilvl="2" w:tplc="100A001B" w:tentative="1">
+      <w:start w:val="1"/>
+      <w:numFmt w:val="lowerRoman"/>
+      <w:lvlText w:val="%3."/>
+      <w:lvlJc w:val="right"/>
+      <w:pPr>
+        <w:ind w:left="2160" w:hanging="180"/>
+      </w:pPr>
+    </w:lvl>
+    <w:lvl w:ilvl="3" w:tplc="100A000F" w:tentative="1">
+      <w:start w:val="1"/>
+      <w:numFmt w:val="decimal"/>
+      <w:lvlText w:val="%4."/>
+      <w:lvlJc w:val="left"/>
+      <w:pPr>
+        <w:ind w:left="2880" w:hanging="360"/>
+      </w:pPr>
+    </w:lvl>
+    <w:lvl w:ilvl="4" w:tplc="100A0019" w:tentative="1">
+      <w:start w:val="1"/>
+      <w:numFmt w:val="lowerLetter"/>
+      <w:lvlText w:val="%5."/>
+      <w:lvlJc w:val="left"/>
+      <w:pPr>
+        <w:ind w:left="3600" w:hanging="360"/>
+      </w:pPr>
+    </w:lvl>
+    <w:lvl w:ilvl="5" w:tplc="100A001B" w:tentative="1">
+      <w:start w:val="1"/>
+      <w:numFmt w:val="lowerRoman"/>
+      <w:lvlText w:val="%6."/>
+      <w:lvlJc w:val="right"/>
+      <w:pPr>
+        <w:ind w:left="4320" w:hanging="180"/>
+      </w:pPr>
+    </w:lvl>
+    <w:lvl w:ilvl="6" w:tplc="100A000F" w:tentative="1">
+      <w:start w:val="1"/>
+      <w:numFmt w:val="decimal"/>
+      <w:lvlText w:val="%7."/>
+      <w:lvlJc w:val="left"/>
+      <w:pPr>
+        <w:ind w:left="5040" w:hanging="360"/>
+      </w:pPr>
+    </w:lvl>
+    <w:lvl w:ilvl="7" w:tplc="100A0019" w:tentative="1">
+      <w:start w:val="1"/>
+      <w:numFmt w:val="lowerLetter"/>
+      <w:lvlText w:val="%8."/>
+      <w:lvlJc w:val="left"/>
+      <w:pPr>
+        <w:ind w:left="5760" w:hanging="360"/>
+      </w:pPr>
+    </w:lvl>
+    <w:lvl w:ilvl="8" w:tplc="100A001B" w:tentative="1">
+      <w:start w:val="1"/>
+      <w:numFmt w:val="lowerRoman"/>
+      <w:lvlText w:val="%9."/>
+      <w:lvlJc w:val="right"/>
+      <w:pPr>
+        <w:ind w:left="6480" w:hanging="180"/>
+      </w:pPr>
+    </w:lvl>
+  </w:abstractNum>
+  <w:abstractNum w:abstractNumId="8" w15:restartNumberingAfterBreak="0">
     <w:nsid w:val="19127582"/>
     <w:multiLevelType w:val="hybridMultilevel"/>
     <w:tmpl w:val="9D2C374C"/>
@@ -4127,7 +4225,7 @@
       </w:pPr>
     </w:lvl>
   </w:abstractNum>
-  <w:abstractNum w:abstractNumId="8" w15:restartNumberingAfterBreak="0">
+  <w:abstractNum w:abstractNumId="9" w15:restartNumberingAfterBreak="0">
     <w:nsid w:val="1F390D10"/>
     <w:multiLevelType w:val="singleLevel"/>
     <w:tmpl w:val="4D90F492"/>
@@ -4142,7 +4240,93 @@
       </w:pPr>
     </w:lvl>
   </w:abstractNum>
-  <w:abstractNum w:abstractNumId="9" w15:restartNumberingAfterBreak="0">
+  <w:abstractNum w:abstractNumId="10" w15:restartNumberingAfterBreak="0">
+    <w:nsid w:val="275A1778"/>
+    <w:multiLevelType w:val="hybridMultilevel"/>
+    <w:tmpl w:val="05863FEC"/>
+    <w:lvl w:ilvl="0" w:tplc="100A000F">
+      <w:start w:val="1"/>
+      <w:numFmt w:val="decimal"/>
+      <w:lvlText w:val="%1."/>
+      <w:lvlJc w:val="left"/>
+      <w:pPr>
+        <w:ind w:left="720" w:hanging="360"/>
+      </w:pPr>
+    </w:lvl>
+    <w:lvl w:ilvl="1" w:tplc="100A0019" w:tentative="1">
+      <w:start w:val="1"/>
+      <w:numFmt w:val="lowerLetter"/>
+      <w:lvlText w:val="%2."/>
+      <w:lvlJc w:val="left"/>
+      <w:pPr>
+        <w:ind w:left="1440" w:hanging="360"/>
+      </w:pPr>
+    </w:lvl>
+    <w:lvl w:ilvl="2" w:tplc="100A001B" w:tentative="1">
+      <w:start w:val="1"/>
+      <w:numFmt w:val="lowerRoman"/>
+      <w:lvlText w:val="%3."/>
+      <w:lvlJc w:val="right"/>
+      <w:pPr>
+        <w:ind w:left="2160" w:hanging="180"/>
+      </w:pPr>
+    </w:lvl>
+    <w:lvl w:ilvl="3" w:tplc="100A000F" w:tentative="1">
+      <w:start w:val="1"/>
+      <w:numFmt w:val="decimal"/>
+      <w:lvlText w:val="%4."/>
+      <w:lvlJc w:val="left"/>
+      <w:pPr>
+        <w:ind w:left="2880" w:hanging="360"/>
+      </w:pPr>
+    </w:lvl>
+    <w:lvl w:ilvl="4" w:tplc="100A0019" w:tentative="1">
+      <w:start w:val="1"/>
+      <w:numFmt w:val="lowerLetter"/>
+      <w:lvlText w:val="%5."/>
+      <w:lvlJc w:val="left"/>
+      <w:pPr>
+        <w:ind w:left="3600" w:hanging="360"/>
+      </w:pPr>
+    </w:lvl>
+    <w:lvl w:ilvl="5" w:tplc="100A001B" w:tentative="1">
+      <w:start w:val="1"/>
+      <w:numFmt w:val="lowerRoman"/>
+      <w:lvlText w:val="%6."/>
+      <w:lvlJc w:val="right"/>
+      <w:pPr>
+        <w:ind w:left="4320" w:hanging="180"/>
+      </w:pPr>
+    </w:lvl>
+    <w:lvl w:ilvl="6" w:tplc="100A000F" w:tentative="1">
+      <w:start w:val="1"/>
+      <w:numFmt w:val="decimal"/>
+      <w:lvlText w:val="%7."/>
+      <w:lvlJc w:val="left"/>
+      <w:pPr>
+        <w:ind w:left="5040" w:hanging="360"/>
+      </w:pPr>
+    </w:lvl>
+    <w:lvl w:ilvl="7" w:tplc="100A0019" w:tentative="1">
+      <w:start w:val="1"/>
+      <w:numFmt w:val="lowerLetter"/>
+      <w:lvlText w:val="%8."/>
+      <w:lvlJc w:val="left"/>
+      <w:pPr>
+        <w:ind w:left="5760" w:hanging="360"/>
+      </w:pPr>
+    </w:lvl>
+    <w:lvl w:ilvl="8" w:tplc="100A001B" w:tentative="1">
+      <w:start w:val="1"/>
+      <w:numFmt w:val="lowerRoman"/>
+      <w:lvlText w:val="%9."/>
+      <w:lvlJc w:val="right"/>
+      <w:pPr>
+        <w:ind w:left="6480" w:hanging="180"/>
+      </w:pPr>
+    </w:lvl>
+  </w:abstractNum>
+  <w:abstractNum w:abstractNumId="11" w15:restartNumberingAfterBreak="0">
     <w:nsid w:val="2EAD69B2"/>
     <w:multiLevelType w:val="singleLevel"/>
     <w:tmpl w:val="4D90F492"/>
@@ -4157,7 +4341,7 @@
       </w:pPr>
     </w:lvl>
   </w:abstractNum>
-  <w:abstractNum w:abstractNumId="10" w15:restartNumberingAfterBreak="0">
+  <w:abstractNum w:abstractNumId="12" w15:restartNumberingAfterBreak="0">
     <w:nsid w:val="3A0A5BE7"/>
     <w:multiLevelType w:val="hybridMultilevel"/>
     <w:tmpl w:val="0AA0074A"/>
@@ -4246,7 +4430,7 @@
       </w:pPr>
     </w:lvl>
   </w:abstractNum>
-  <w:abstractNum w:abstractNumId="11" w15:restartNumberingAfterBreak="0">
+  <w:abstractNum w:abstractNumId="13" w15:restartNumberingAfterBreak="0">
     <w:nsid w:val="3D216DD9"/>
     <w:multiLevelType w:val="hybridMultilevel"/>
     <w:tmpl w:val="61B6E42C"/>
@@ -4335,7 +4519,7 @@
       </w:pPr>
     </w:lvl>
   </w:abstractNum>
-  <w:abstractNum w:abstractNumId="12" w15:restartNumberingAfterBreak="0">
+  <w:abstractNum w:abstractNumId="14" w15:restartNumberingAfterBreak="0">
     <w:nsid w:val="3D441E1C"/>
     <w:multiLevelType w:val="multilevel"/>
     <w:tmpl w:val="0409001F"/>
@@ -4424,7 +4608,93 @@
       </w:pPr>
     </w:lvl>
   </w:abstractNum>
-  <w:abstractNum w:abstractNumId="13" w15:restartNumberingAfterBreak="0">
+  <w:abstractNum w:abstractNumId="15" w15:restartNumberingAfterBreak="0">
+    <w:nsid w:val="43383BFE"/>
+    <w:multiLevelType w:val="hybridMultilevel"/>
+    <w:tmpl w:val="05863FEC"/>
+    <w:lvl w:ilvl="0" w:tplc="100A000F">
+      <w:start w:val="1"/>
+      <w:numFmt w:val="decimal"/>
+      <w:lvlText w:val="%1."/>
+      <w:lvlJc w:val="left"/>
+      <w:pPr>
+        <w:ind w:left="720" w:hanging="360"/>
+      </w:pPr>
+    </w:lvl>
+    <w:lvl w:ilvl="1" w:tplc="100A0019" w:tentative="1">
+      <w:start w:val="1"/>
+      <w:numFmt w:val="lowerLetter"/>
+      <w:lvlText w:val="%2."/>
+      <w:lvlJc w:val="left"/>
+      <w:pPr>
+        <w:ind w:left="1440" w:hanging="360"/>
+      </w:pPr>
+    </w:lvl>
+    <w:lvl w:ilvl="2" w:tplc="100A001B" w:tentative="1">
+      <w:start w:val="1"/>
+      <w:numFmt w:val="lowerRoman"/>
+      <w:lvlText w:val="%3."/>
+      <w:lvlJc w:val="right"/>
+      <w:pPr>
+        <w:ind w:left="2160" w:hanging="180"/>
+      </w:pPr>
+    </w:lvl>
+    <w:lvl w:ilvl="3" w:tplc="100A000F" w:tentative="1">
+      <w:start w:val="1"/>
+      <w:numFmt w:val="decimal"/>
+      <w:lvlText w:val="%4."/>
+      <w:lvlJc w:val="left"/>
+      <w:pPr>
+        <w:ind w:left="2880" w:hanging="360"/>
+      </w:pPr>
+    </w:lvl>
+    <w:lvl w:ilvl="4" w:tplc="100A0019" w:tentative="1">
+      <w:start w:val="1"/>
+      <w:numFmt w:val="lowerLetter"/>
+      <w:lvlText w:val="%5."/>
+      <w:lvlJc w:val="left"/>
+      <w:pPr>
+        <w:ind w:left="3600" w:hanging="360"/>
+      </w:pPr>
+    </w:lvl>
+    <w:lvl w:ilvl="5" w:tplc="100A001B" w:tentative="1">
+      <w:start w:val="1"/>
+      <w:numFmt w:val="lowerRoman"/>
+      <w:lvlText w:val="%6."/>
+      <w:lvlJc w:val="right"/>
+      <w:pPr>
+        <w:ind w:left="4320" w:hanging="180"/>
+      </w:pPr>
+    </w:lvl>
+    <w:lvl w:ilvl="6" w:tplc="100A000F" w:tentative="1">
+      <w:start w:val="1"/>
+      <w:numFmt w:val="decimal"/>
+      <w:lvlText w:val="%7."/>
+      <w:lvlJc w:val="left"/>
+      <w:pPr>
+        <w:ind w:left="5040" w:hanging="360"/>
+      </w:pPr>
+    </w:lvl>
+    <w:lvl w:ilvl="7" w:tplc="100A0019" w:tentative="1">
+      <w:start w:val="1"/>
+      <w:numFmt w:val="lowerLetter"/>
+      <w:lvlText w:val="%8."/>
+      <w:lvlJc w:val="left"/>
+      <w:pPr>
+        <w:ind w:left="5760" w:hanging="360"/>
+      </w:pPr>
+    </w:lvl>
+    <w:lvl w:ilvl="8" w:tplc="100A001B" w:tentative="1">
+      <w:start w:val="1"/>
+      <w:numFmt w:val="lowerRoman"/>
+      <w:lvlText w:val="%9."/>
+      <w:lvlJc w:val="right"/>
+      <w:pPr>
+        <w:ind w:left="6480" w:hanging="180"/>
+      </w:pPr>
+    </w:lvl>
+  </w:abstractNum>
+  <w:abstractNum w:abstractNumId="16" w15:restartNumberingAfterBreak="0">
     <w:nsid w:val="433C1667"/>
     <w:multiLevelType w:val="hybridMultilevel"/>
     <w:tmpl w:val="29CCE532"/>
@@ -4510,7 +4780,7 @@
       </w:pPr>
     </w:lvl>
   </w:abstractNum>
-  <w:abstractNum w:abstractNumId="14" w15:restartNumberingAfterBreak="0">
+  <w:abstractNum w:abstractNumId="17" w15:restartNumberingAfterBreak="0">
     <w:nsid w:val="468E7701"/>
     <w:multiLevelType w:val="multilevel"/>
     <w:tmpl w:val="85A0DEC6"/>
@@ -4659,7 +4929,7 @@
       </w:rPr>
     </w:lvl>
   </w:abstractNum>
-  <w:abstractNum w:abstractNumId="15" w15:restartNumberingAfterBreak="0">
+  <w:abstractNum w:abstractNumId="18" w15:restartNumberingAfterBreak="0">
     <w:nsid w:val="47571CF2"/>
     <w:multiLevelType w:val="hybridMultilevel"/>
     <w:tmpl w:val="FEBADBA0"/>
@@ -4745,7 +5015,7 @@
       </w:pPr>
     </w:lvl>
   </w:abstractNum>
-  <w:abstractNum w:abstractNumId="16" w15:restartNumberingAfterBreak="0">
+  <w:abstractNum w:abstractNumId="19" w15:restartNumberingAfterBreak="0">
     <w:nsid w:val="4E5005E9"/>
     <w:multiLevelType w:val="hybridMultilevel"/>
     <w:tmpl w:val="97AAC656"/>
@@ -4834,7 +5104,7 @@
       </w:pPr>
     </w:lvl>
   </w:abstractNum>
-  <w:abstractNum w:abstractNumId="17" w15:restartNumberingAfterBreak="0">
+  <w:abstractNum w:abstractNumId="20" w15:restartNumberingAfterBreak="0">
     <w:nsid w:val="5C8A5CBA"/>
     <w:multiLevelType w:val="hybridMultilevel"/>
     <w:tmpl w:val="05863FEC"/>
@@ -4920,7 +5190,93 @@
       </w:pPr>
     </w:lvl>
   </w:abstractNum>
-  <w:abstractNum w:abstractNumId="18" w15:restartNumberingAfterBreak="0">
+  <w:abstractNum w:abstractNumId="21" w15:restartNumberingAfterBreak="0">
+    <w:nsid w:val="600DA910"/>
+    <w:multiLevelType w:val="hybridMultilevel"/>
+    <w:tmpl w:val="05863FEC"/>
+    <w:lvl w:ilvl="0" w:tplc="100A000F">
+      <w:start w:val="1"/>
+      <w:numFmt w:val="decimal"/>
+      <w:lvlText w:val="%1."/>
+      <w:lvlJc w:val="left"/>
+      <w:pPr>
+        <w:ind w:left="720" w:hanging="360"/>
+      </w:pPr>
+    </w:lvl>
+    <w:lvl w:ilvl="1" w:tplc="100A0019" w:tentative="1">
+      <w:start w:val="1"/>
+      <w:numFmt w:val="lowerLetter"/>
+      <w:lvlText w:val="%2."/>
+      <w:lvlJc w:val="left"/>
+      <w:pPr>
+        <w:ind w:left="1440" w:hanging="360"/>
+      </w:pPr>
+    </w:lvl>
+    <w:lvl w:ilvl="2" w:tplc="100A001B" w:tentative="1">
+      <w:start w:val="1"/>
+      <w:numFmt w:val="lowerRoman"/>
+      <w:lvlText w:val="%3."/>
+      <w:lvlJc w:val="right"/>
+      <w:pPr>
+        <w:ind w:left="2160" w:hanging="180"/>
+      </w:pPr>
+    </w:lvl>
+    <w:lvl w:ilvl="3" w:tplc="100A000F" w:tentative="1">
+      <w:start w:val="1"/>
+      <w:numFmt w:val="decimal"/>
+      <w:lvlText w:val="%4."/>
+      <w:lvlJc w:val="left"/>
+      <w:pPr>
+        <w:ind w:left="2880" w:hanging="360"/>
+      </w:pPr>
+    </w:lvl>
+    <w:lvl w:ilvl="4" w:tplc="100A0019" w:tentative="1">
+      <w:start w:val="1"/>
+      <w:numFmt w:val="lowerLetter"/>
+      <w:lvlText w:val="%5."/>
+      <w:lvlJc w:val="left"/>
+      <w:pPr>
+        <w:ind w:left="3600" w:hanging="360"/>
+      </w:pPr>
+    </w:lvl>
+    <w:lvl w:ilvl="5" w:tplc="100A001B" w:tentative="1">
+      <w:start w:val="1"/>
+      <w:numFmt w:val="lowerRoman"/>
+      <w:lvlText w:val="%6."/>
+      <w:lvlJc w:val="right"/>
+      <w:pPr>
+        <w:ind w:left="4320" w:hanging="180"/>
+      </w:pPr>
+    </w:lvl>
+    <w:lvl w:ilvl="6" w:tplc="100A000F" w:tentative="1">
+      <w:start w:val="1"/>
+      <w:numFmt w:val="decimal"/>
+      <w:lvlText w:val="%7."/>
+      <w:lvlJc w:val="left"/>
+      <w:pPr>
+        <w:ind w:left="5040" w:hanging="360"/>
+      </w:pPr>
+    </w:lvl>
+    <w:lvl w:ilvl="7" w:tplc="100A0019" w:tentative="1">
+      <w:start w:val="1"/>
+      <w:numFmt w:val="lowerLetter"/>
+      <w:lvlText w:val="%8."/>
+      <w:lvlJc w:val="left"/>
+      <w:pPr>
+        <w:ind w:left="5760" w:hanging="360"/>
+      </w:pPr>
+    </w:lvl>
+    <w:lvl w:ilvl="8" w:tplc="100A001B" w:tentative="1">
+      <w:start w:val="1"/>
+      <w:numFmt w:val="lowerRoman"/>
+      <w:lvlText w:val="%9."/>
+      <w:lvlJc w:val="right"/>
+      <w:pPr>
+        <w:ind w:left="6480" w:hanging="180"/>
+      </w:pPr>
+    </w:lvl>
+  </w:abstractNum>
+  <w:abstractNum w:abstractNumId="22" w15:restartNumberingAfterBreak="0">
     <w:nsid w:val="70926623"/>
     <w:multiLevelType w:val="hybridMultilevel"/>
     <w:tmpl w:val="59F69580"/>
@@ -5009,7 +5365,93 @@
       </w:pPr>
     </w:lvl>
   </w:abstractNum>
-  <w:abstractNum w:abstractNumId="19" w15:restartNumberingAfterBreak="0">
+  <w:abstractNum w:abstractNumId="23" w15:restartNumberingAfterBreak="0">
+    <w:nsid w:val="710BFB22"/>
+    <w:multiLevelType w:val="hybridMultilevel"/>
+    <w:tmpl w:val="05863FEC"/>
+    <w:lvl w:ilvl="0" w:tplc="100A000F">
+      <w:start w:val="1"/>
+      <w:numFmt w:val="decimal"/>
+      <w:lvlText w:val="%1."/>
+      <w:lvlJc w:val="left"/>
+      <w:pPr>
+        <w:ind w:left="720" w:hanging="360"/>
+      </w:pPr>
+    </w:lvl>
+    <w:lvl w:ilvl="1" w:tplc="100A0019" w:tentative="1">
+      <w:start w:val="1"/>
+      <w:numFmt w:val="lowerLetter"/>
+      <w:lvlText w:val="%2."/>
+      <w:lvlJc w:val="left"/>
+      <w:pPr>
+        <w:ind w:left="1440" w:hanging="360"/>
+      </w:pPr>
+    </w:lvl>
+    <w:lvl w:ilvl="2" w:tplc="100A001B" w:tentative="1">
+      <w:start w:val="1"/>
+      <w:numFmt w:val="lowerRoman"/>
+      <w:lvlText w:val="%3."/>
+      <w:lvlJc w:val="right"/>
+      <w:pPr>
+        <w:ind w:left="2160" w:hanging="180"/>
+      </w:pPr>
+    </w:lvl>
+    <w:lvl w:ilvl="3" w:tplc="100A000F" w:tentative="1">
+      <w:start w:val="1"/>
+      <w:numFmt w:val="decimal"/>
+      <w:lvlText w:val="%4."/>
+      <w:lvlJc w:val="left"/>
+      <w:pPr>
+        <w:ind w:left="2880" w:hanging="360"/>
+      </w:pPr>
+    </w:lvl>
+    <w:lvl w:ilvl="4" w:tplc="100A0019" w:tentative="1">
+      <w:start w:val="1"/>
+      <w:numFmt w:val="lowerLetter"/>
+      <w:lvlText w:val="%5."/>
+      <w:lvlJc w:val="left"/>
+      <w:pPr>
+        <w:ind w:left="3600" w:hanging="360"/>
+      </w:pPr>
+    </w:lvl>
+    <w:lvl w:ilvl="5" w:tplc="100A001B" w:tentative="1">
+      <w:start w:val="1"/>
+      <w:numFmt w:val="lowerRoman"/>
+      <w:lvlText w:val="%6."/>
+      <w:lvlJc w:val="right"/>
+      <w:pPr>
+        <w:ind w:left="4320" w:hanging="180"/>
+      </w:pPr>
+    </w:lvl>
+    <w:lvl w:ilvl="6" w:tplc="100A000F" w:tentative="1">
+      <w:start w:val="1"/>
+      <w:numFmt w:val="decimal"/>
+      <w:lvlText w:val="%7."/>
+      <w:lvlJc w:val="left"/>
+      <w:pPr>
+        <w:ind w:left="5040" w:hanging="360"/>
+      </w:pPr>
+    </w:lvl>
+    <w:lvl w:ilvl="7" w:tplc="100A0019" w:tentative="1">
+      <w:start w:val="1"/>
+      <w:numFmt w:val="lowerLetter"/>
+      <w:lvlText w:val="%8."/>
+      <w:lvlJc w:val="left"/>
+      <w:pPr>
+        <w:ind w:left="5760" w:hanging="360"/>
+      </w:pPr>
+    </w:lvl>
+    <w:lvl w:ilvl="8" w:tplc="100A001B" w:tentative="1">
+      <w:start w:val="1"/>
+      <w:numFmt w:val="lowerRoman"/>
+      <w:lvlText w:val="%9."/>
+      <w:lvlJc w:val="right"/>
+      <w:pPr>
+        <w:ind w:left="6480" w:hanging="180"/>
+      </w:pPr>
+    </w:lvl>
+  </w:abstractNum>
+  <w:abstractNum w:abstractNumId="24" w15:restartNumberingAfterBreak="0">
     <w:nsid w:val="73112FDD"/>
     <w:multiLevelType w:val="hybridMultilevel"/>
     <w:tmpl w:val="FEBADBA0"/>
@@ -5095,7 +5537,7 @@
       </w:pPr>
     </w:lvl>
   </w:abstractNum>
-  <w:abstractNum w:abstractNumId="20" w15:restartNumberingAfterBreak="0">
+  <w:abstractNum w:abstractNumId="25" w15:restartNumberingAfterBreak="0">
     <w:nsid w:val="757B3DE1"/>
     <w:multiLevelType w:val="hybridMultilevel"/>
     <w:tmpl w:val="97AAC656"/>
@@ -5184,7 +5626,7 @@
       </w:pPr>
     </w:lvl>
   </w:abstractNum>
-  <w:abstractNum w:abstractNumId="21" w15:restartNumberingAfterBreak="0">
+  <w:abstractNum w:abstractNumId="26" w15:restartNumberingAfterBreak="0">
     <w:nsid w:val="77F5392A"/>
     <w:multiLevelType w:val="hybridMultilevel"/>
     <w:tmpl w:val="6E72A7EA"/>
@@ -5273,7 +5715,7 @@
       </w:pPr>
     </w:lvl>
   </w:abstractNum>
-  <w:abstractNum w:abstractNumId="22" w15:restartNumberingAfterBreak="0">
+  <w:abstractNum w:abstractNumId="27" w15:restartNumberingAfterBreak="0">
     <w:nsid w:val="7A492679"/>
     <w:multiLevelType w:val="hybridMultilevel"/>
     <w:tmpl w:val="45E6E7B8"/>
@@ -5362,7 +5804,7 @@
       </w:pPr>
     </w:lvl>
   </w:abstractNum>
-  <w:abstractNum w:abstractNumId="23" w15:restartNumberingAfterBreak="0">
+  <w:abstractNum w:abstractNumId="28" w15:restartNumberingAfterBreak="0">
     <w:nsid w:val="7EA42152"/>
     <w:multiLevelType w:val="multilevel"/>
     <w:tmpl w:val="100A001F"/>
@@ -5448,533 +5890,103 @@
       </w:pPr>
     </w:lvl>
   </w:abstractNum>
-  <w:abstractNum w:abstractNumId="24" w15:restartNumberingAfterBreak="0">
-    <w:nsid w:val="710BFB22"/>
-    <w:multiLevelType w:val="hybridMultilevel"/>
-    <w:tmpl w:val="05863FEC"/>
-    <w:lvl w:ilvl="0" w:tplc="100A000F">
-      <w:start w:val="1"/>
-      <w:numFmt w:val="decimal"/>
-      <w:lvlText w:val="%1."/>
-      <w:lvlJc w:val="left"/>
-      <w:pPr>
-        <w:ind w:left="720" w:hanging="360"/>
-      </w:pPr>
-    </w:lvl>
-    <w:lvl w:ilvl="1" w:tplc="100A0019" w:tentative="1">
-      <w:start w:val="1"/>
-      <w:numFmt w:val="lowerLetter"/>
-      <w:lvlText w:val="%2."/>
-      <w:lvlJc w:val="left"/>
-      <w:pPr>
-        <w:ind w:left="1440" w:hanging="360"/>
-      </w:pPr>
-    </w:lvl>
-    <w:lvl w:ilvl="2" w:tplc="100A001B" w:tentative="1">
-      <w:start w:val="1"/>
-      <w:numFmt w:val="lowerRoman"/>
-      <w:lvlText w:val="%3."/>
-      <w:lvlJc w:val="right"/>
-      <w:pPr>
-        <w:ind w:left="2160" w:hanging="180"/>
-      </w:pPr>
-    </w:lvl>
-    <w:lvl w:ilvl="3" w:tplc="100A000F" w:tentative="1">
-      <w:start w:val="1"/>
-      <w:numFmt w:val="decimal"/>
-      <w:lvlText w:val="%4."/>
-      <w:lvlJc w:val="left"/>
-      <w:pPr>
-        <w:ind w:left="2880" w:hanging="360"/>
-      </w:pPr>
-    </w:lvl>
-    <w:lvl w:ilvl="4" w:tplc="100A0019" w:tentative="1">
-      <w:start w:val="1"/>
-      <w:numFmt w:val="lowerLetter"/>
-      <w:lvlText w:val="%5."/>
-      <w:lvlJc w:val="left"/>
-      <w:pPr>
-        <w:ind w:left="3600" w:hanging="360"/>
-      </w:pPr>
-    </w:lvl>
-    <w:lvl w:ilvl="5" w:tplc="100A001B" w:tentative="1">
-      <w:start w:val="1"/>
-      <w:numFmt w:val="lowerRoman"/>
-      <w:lvlText w:val="%6."/>
-      <w:lvlJc w:val="right"/>
-      <w:pPr>
-        <w:ind w:left="4320" w:hanging="180"/>
-      </w:pPr>
-    </w:lvl>
-    <w:lvl w:ilvl="6" w:tplc="100A000F" w:tentative="1">
-      <w:start w:val="1"/>
-      <w:numFmt w:val="decimal"/>
-      <w:lvlText w:val="%7."/>
-      <w:lvlJc w:val="left"/>
-      <w:pPr>
-        <w:ind w:left="5040" w:hanging="360"/>
-      </w:pPr>
-    </w:lvl>
-    <w:lvl w:ilvl="7" w:tplc="100A0019" w:tentative="1">
-      <w:start w:val="1"/>
-      <w:numFmt w:val="lowerLetter"/>
-      <w:lvlText w:val="%8."/>
-      <w:lvlJc w:val="left"/>
-      <w:pPr>
-        <w:ind w:left="5760" w:hanging="360"/>
-      </w:pPr>
-    </w:lvl>
-    <w:lvl w:ilvl="8" w:tplc="100A001B" w:tentative="1">
-      <w:start w:val="1"/>
-      <w:numFmt w:val="lowerRoman"/>
-      <w:lvlText w:val="%9."/>
-      <w:lvlJc w:val="right"/>
-      <w:pPr>
-        <w:ind w:left="6480" w:hanging="180"/>
-      </w:pPr>
-    </w:lvl>
-  </w:abstractNum>
-  <w:abstractNum w:abstractNumId="25" w15:restartNumberingAfterBreak="0">
-    <w:nsid w:val="275A1778"/>
-    <w:multiLevelType w:val="hybridMultilevel"/>
-    <w:tmpl w:val="05863FEC"/>
-    <w:lvl w:ilvl="0" w:tplc="100A000F">
-      <w:start w:val="1"/>
-      <w:numFmt w:val="decimal"/>
-      <w:lvlText w:val="%1."/>
-      <w:lvlJc w:val="left"/>
-      <w:pPr>
-        <w:ind w:left="720" w:hanging="360"/>
-      </w:pPr>
-    </w:lvl>
-    <w:lvl w:ilvl="1" w:tplc="100A0019" w:tentative="1">
-      <w:start w:val="1"/>
-      <w:numFmt w:val="lowerLetter"/>
-      <w:lvlText w:val="%2."/>
-      <w:lvlJc w:val="left"/>
-      <w:pPr>
-        <w:ind w:left="1440" w:hanging="360"/>
-      </w:pPr>
-    </w:lvl>
-    <w:lvl w:ilvl="2" w:tplc="100A001B" w:tentative="1">
-      <w:start w:val="1"/>
-      <w:numFmt w:val="lowerRoman"/>
-      <w:lvlText w:val="%3."/>
-      <w:lvlJc w:val="right"/>
-      <w:pPr>
-        <w:ind w:left="2160" w:hanging="180"/>
-      </w:pPr>
-    </w:lvl>
-    <w:lvl w:ilvl="3" w:tplc="100A000F" w:tentative="1">
-      <w:start w:val="1"/>
-      <w:numFmt w:val="decimal"/>
-      <w:lvlText w:val="%4."/>
-      <w:lvlJc w:val="left"/>
-      <w:pPr>
-        <w:ind w:left="2880" w:hanging="360"/>
-      </w:pPr>
-    </w:lvl>
-    <w:lvl w:ilvl="4" w:tplc="100A0019" w:tentative="1">
-      <w:start w:val="1"/>
-      <w:numFmt w:val="lowerLetter"/>
-      <w:lvlText w:val="%5."/>
-      <w:lvlJc w:val="left"/>
-      <w:pPr>
-        <w:ind w:left="3600" w:hanging="360"/>
-      </w:pPr>
-    </w:lvl>
-    <w:lvl w:ilvl="5" w:tplc="100A001B" w:tentative="1">
-      <w:start w:val="1"/>
-      <w:numFmt w:val="lowerRoman"/>
-      <w:lvlText w:val="%6."/>
-      <w:lvlJc w:val="right"/>
-      <w:pPr>
-        <w:ind w:left="4320" w:hanging="180"/>
-      </w:pPr>
-    </w:lvl>
-    <w:lvl w:ilvl="6" w:tplc="100A000F" w:tentative="1">
-      <w:start w:val="1"/>
-      <w:numFmt w:val="decimal"/>
-      <w:lvlText w:val="%7."/>
-      <w:lvlJc w:val="left"/>
-      <w:pPr>
-        <w:ind w:left="5040" w:hanging="360"/>
-      </w:pPr>
-    </w:lvl>
-    <w:lvl w:ilvl="7" w:tplc="100A0019" w:tentative="1">
-      <w:start w:val="1"/>
-      <w:numFmt w:val="lowerLetter"/>
-      <w:lvlText w:val="%8."/>
-      <w:lvlJc w:val="left"/>
-      <w:pPr>
-        <w:ind w:left="5760" w:hanging="360"/>
-      </w:pPr>
-    </w:lvl>
-    <w:lvl w:ilvl="8" w:tplc="100A001B" w:tentative="1">
-      <w:start w:val="1"/>
-      <w:numFmt w:val="lowerRoman"/>
-      <w:lvlText w:val="%9."/>
-      <w:lvlJc w:val="right"/>
-      <w:pPr>
-        <w:ind w:left="6480" w:hanging="180"/>
-      </w:pPr>
-    </w:lvl>
-  </w:abstractNum>
-  <w:abstractNum w:abstractNumId="26" w15:restartNumberingAfterBreak="0">
-    <w:nsid w:val="1827B527"/>
-    <w:multiLevelType w:val="hybridMultilevel"/>
-    <w:tmpl w:val="05863FEC"/>
-    <w:lvl w:ilvl="0" w:tplc="100A000F">
-      <w:start w:val="1"/>
-      <w:numFmt w:val="decimal"/>
-      <w:lvlText w:val="%1."/>
-      <w:lvlJc w:val="left"/>
-      <w:pPr>
-        <w:ind w:left="720" w:hanging="360"/>
-      </w:pPr>
-    </w:lvl>
-    <w:lvl w:ilvl="1" w:tplc="100A0019" w:tentative="1">
-      <w:start w:val="1"/>
-      <w:numFmt w:val="lowerLetter"/>
-      <w:lvlText w:val="%2."/>
-      <w:lvlJc w:val="left"/>
-      <w:pPr>
-        <w:ind w:left="1440" w:hanging="360"/>
-      </w:pPr>
-    </w:lvl>
-    <w:lvl w:ilvl="2" w:tplc="100A001B" w:tentative="1">
-      <w:start w:val="1"/>
-      <w:numFmt w:val="lowerRoman"/>
-      <w:lvlText w:val="%3."/>
-      <w:lvlJc w:val="right"/>
-      <w:pPr>
-        <w:ind w:left="2160" w:hanging="180"/>
-      </w:pPr>
-    </w:lvl>
-    <w:lvl w:ilvl="3" w:tplc="100A000F" w:tentative="1">
-      <w:start w:val="1"/>
-      <w:numFmt w:val="decimal"/>
-      <w:lvlText w:val="%4."/>
-      <w:lvlJc w:val="left"/>
-      <w:pPr>
-        <w:ind w:left="2880" w:hanging="360"/>
-      </w:pPr>
-    </w:lvl>
-    <w:lvl w:ilvl="4" w:tplc="100A0019" w:tentative="1">
-      <w:start w:val="1"/>
-      <w:numFmt w:val="lowerLetter"/>
-      <w:lvlText w:val="%5."/>
-      <w:lvlJc w:val="left"/>
-      <w:pPr>
-        <w:ind w:left="3600" w:hanging="360"/>
-      </w:pPr>
-    </w:lvl>
-    <w:lvl w:ilvl="5" w:tplc="100A001B" w:tentative="1">
-      <w:start w:val="1"/>
-      <w:numFmt w:val="lowerRoman"/>
-      <w:lvlText w:val="%6."/>
-      <w:lvlJc w:val="right"/>
-      <w:pPr>
-        <w:ind w:left="4320" w:hanging="180"/>
-      </w:pPr>
-    </w:lvl>
-    <w:lvl w:ilvl="6" w:tplc="100A000F" w:tentative="1">
-      <w:start w:val="1"/>
-      <w:numFmt w:val="decimal"/>
-      <w:lvlText w:val="%7."/>
-      <w:lvlJc w:val="left"/>
-      <w:pPr>
-        <w:ind w:left="5040" w:hanging="360"/>
-      </w:pPr>
-    </w:lvl>
-    <w:lvl w:ilvl="7" w:tplc="100A0019" w:tentative="1">
-      <w:start w:val="1"/>
-      <w:numFmt w:val="lowerLetter"/>
-      <w:lvlText w:val="%8."/>
-      <w:lvlJc w:val="left"/>
-      <w:pPr>
-        <w:ind w:left="5760" w:hanging="360"/>
-      </w:pPr>
-    </w:lvl>
-    <w:lvl w:ilvl="8" w:tplc="100A001B" w:tentative="1">
-      <w:start w:val="1"/>
-      <w:numFmt w:val="lowerRoman"/>
-      <w:lvlText w:val="%9."/>
-      <w:lvlJc w:val="right"/>
-      <w:pPr>
-        <w:ind w:left="6480" w:hanging="180"/>
-      </w:pPr>
-    </w:lvl>
-  </w:abstractNum>
-  <w:abstractNum w:abstractNumId="27" w15:restartNumberingAfterBreak="0">
-    <w:nsid w:val="43383BFE"/>
-    <w:multiLevelType w:val="hybridMultilevel"/>
-    <w:tmpl w:val="05863FEC"/>
-    <w:lvl w:ilvl="0" w:tplc="100A000F">
-      <w:start w:val="1"/>
-      <w:numFmt w:val="decimal"/>
-      <w:lvlText w:val="%1."/>
-      <w:lvlJc w:val="left"/>
-      <w:pPr>
-        <w:ind w:left="720" w:hanging="360"/>
-      </w:pPr>
-    </w:lvl>
-    <w:lvl w:ilvl="1" w:tplc="100A0019" w:tentative="1">
-      <w:start w:val="1"/>
-      <w:numFmt w:val="lowerLetter"/>
-      <w:lvlText w:val="%2."/>
-      <w:lvlJc w:val="left"/>
-      <w:pPr>
-        <w:ind w:left="1440" w:hanging="360"/>
-      </w:pPr>
-    </w:lvl>
-    <w:lvl w:ilvl="2" w:tplc="100A001B" w:tentative="1">
-      <w:start w:val="1"/>
-      <w:numFmt w:val="lowerRoman"/>
-      <w:lvlText w:val="%3."/>
-      <w:lvlJc w:val="right"/>
-      <w:pPr>
-        <w:ind w:left="2160" w:hanging="180"/>
-      </w:pPr>
-    </w:lvl>
-    <w:lvl w:ilvl="3" w:tplc="100A000F" w:tentative="1">
-      <w:start w:val="1"/>
-      <w:numFmt w:val="decimal"/>
-      <w:lvlText w:val="%4."/>
-      <w:lvlJc w:val="left"/>
-      <w:pPr>
-        <w:ind w:left="2880" w:hanging="360"/>
-      </w:pPr>
-    </w:lvl>
-    <w:lvl w:ilvl="4" w:tplc="100A0019" w:tentative="1">
-      <w:start w:val="1"/>
-      <w:numFmt w:val="lowerLetter"/>
-      <w:lvlText w:val="%5."/>
-      <w:lvlJc w:val="left"/>
-      <w:pPr>
-        <w:ind w:left="3600" w:hanging="360"/>
-      </w:pPr>
-    </w:lvl>
-    <w:lvl w:ilvl="5" w:tplc="100A001B" w:tentative="1">
-      <w:start w:val="1"/>
-      <w:numFmt w:val="lowerRoman"/>
-      <w:lvlText w:val="%6."/>
-      <w:lvlJc w:val="right"/>
-      <w:pPr>
-        <w:ind w:left="4320" w:hanging="180"/>
-      </w:pPr>
-    </w:lvl>
-    <w:lvl w:ilvl="6" w:tplc="100A000F" w:tentative="1">
-      <w:start w:val="1"/>
-      <w:numFmt w:val="decimal"/>
-      <w:lvlText w:val="%7."/>
-      <w:lvlJc w:val="left"/>
-      <w:pPr>
-        <w:ind w:left="5040" w:hanging="360"/>
-      </w:pPr>
-    </w:lvl>
-    <w:lvl w:ilvl="7" w:tplc="100A0019" w:tentative="1">
-      <w:start w:val="1"/>
-      <w:numFmt w:val="lowerLetter"/>
-      <w:lvlText w:val="%8."/>
-      <w:lvlJc w:val="left"/>
-      <w:pPr>
-        <w:ind w:left="5760" w:hanging="360"/>
-      </w:pPr>
-    </w:lvl>
-    <w:lvl w:ilvl="8" w:tplc="100A001B" w:tentative="1">
-      <w:start w:val="1"/>
-      <w:numFmt w:val="lowerRoman"/>
-      <w:lvlText w:val="%9."/>
-      <w:lvlJc w:val="right"/>
-      <w:pPr>
-        <w:ind w:left="6480" w:hanging="180"/>
-      </w:pPr>
-    </w:lvl>
-  </w:abstractNum>
-  <w:abstractNum w:abstractNumId="28" w15:restartNumberingAfterBreak="0">
-    <w:nsid w:val="600DA910"/>
-    <w:multiLevelType w:val="hybridMultilevel"/>
-    <w:tmpl w:val="05863FEC"/>
-    <w:lvl w:ilvl="0" w:tplc="100A000F">
-      <w:start w:val="1"/>
-      <w:numFmt w:val="decimal"/>
-      <w:lvlText w:val="%1."/>
-      <w:lvlJc w:val="left"/>
-      <w:pPr>
-        <w:ind w:left="720" w:hanging="360"/>
-      </w:pPr>
-    </w:lvl>
-    <w:lvl w:ilvl="1" w:tplc="100A0019" w:tentative="1">
-      <w:start w:val="1"/>
-      <w:numFmt w:val="lowerLetter"/>
-      <w:lvlText w:val="%2."/>
-      <w:lvlJc w:val="left"/>
-      <w:pPr>
-        <w:ind w:left="1440" w:hanging="360"/>
-      </w:pPr>
-    </w:lvl>
-    <w:lvl w:ilvl="2" w:tplc="100A001B" w:tentative="1">
-      <w:start w:val="1"/>
-      <w:numFmt w:val="lowerRoman"/>
-      <w:lvlText w:val="%3."/>
-      <w:lvlJc w:val="right"/>
-      <w:pPr>
-        <w:ind w:left="2160" w:hanging="180"/>
-      </w:pPr>
-    </w:lvl>
-    <w:lvl w:ilvl="3" w:tplc="100A000F" w:tentative="1">
-      <w:start w:val="1"/>
-      <w:numFmt w:val="decimal"/>
-      <w:lvlText w:val="%4."/>
-      <w:lvlJc w:val="left"/>
-      <w:pPr>
-        <w:ind w:left="2880" w:hanging="360"/>
-      </w:pPr>
-    </w:lvl>
-    <w:lvl w:ilvl="4" w:tplc="100A0019" w:tentative="1">
-      <w:start w:val="1"/>
-      <w:numFmt w:val="lowerLetter"/>
-      <w:lvlText w:val="%5."/>
-      <w:lvlJc w:val="left"/>
-      <w:pPr>
-        <w:ind w:left="3600" w:hanging="360"/>
-      </w:pPr>
-    </w:lvl>
-    <w:lvl w:ilvl="5" w:tplc="100A001B" w:tentative="1">
-      <w:start w:val="1"/>
-      <w:numFmt w:val="lowerRoman"/>
-      <w:lvlText w:val="%6."/>
-      <w:lvlJc w:val="right"/>
-      <w:pPr>
-        <w:ind w:left="4320" w:hanging="180"/>
-      </w:pPr>
-    </w:lvl>
-    <w:lvl w:ilvl="6" w:tplc="100A000F" w:tentative="1">
-      <w:start w:val="1"/>
-      <w:numFmt w:val="decimal"/>
-      <w:lvlText w:val="%7."/>
-      <w:lvlJc w:val="left"/>
-      <w:pPr>
-        <w:ind w:left="5040" w:hanging="360"/>
-      </w:pPr>
-    </w:lvl>
-    <w:lvl w:ilvl="7" w:tplc="100A0019" w:tentative="1">
-      <w:start w:val="1"/>
-      <w:numFmt w:val="lowerLetter"/>
-      <w:lvlText w:val="%8."/>
-      <w:lvlJc w:val="left"/>
-      <w:pPr>
-        <w:ind w:left="5760" w:hanging="360"/>
-      </w:pPr>
-    </w:lvl>
-    <w:lvl w:ilvl="8" w:tplc="100A001B" w:tentative="1">
-      <w:start w:val="1"/>
-      <w:numFmt w:val="lowerRoman"/>
-      <w:lvlText w:val="%9."/>
-      <w:lvlJc w:val="right"/>
-      <w:pPr>
-        <w:ind w:left="6480" w:hanging="180"/>
-      </w:pPr>
-    </w:lvl>
-  </w:abstractNum>
-  <w:num w:numId="1" w16cid:durableId="1131938423">
+  <w:num w:numId="1">
+    <w:abstractNumId w:val="17"/>
+  </w:num>
+  <w:num w:numId="2">
+    <w:abstractNumId w:val="2"/>
+  </w:num>
+  <w:num w:numId="3">
+    <w:abstractNumId w:val="0"/>
+  </w:num>
+  <w:num w:numId="4">
     <w:abstractNumId w:val="14"/>
   </w:num>
-  <w:num w:numId="2" w16cid:durableId="1376583901">
-    <w:abstractNumId w:val="2"/>
+  <w:num w:numId="5">
+    <w:abstractNumId w:val="11"/>
   </w:num>
-  <w:num w:numId="3" w16cid:durableId="1464151694">
-    <w:abstractNumId w:val="0"/>
+  <w:num w:numId="6">
+    <w:abstractNumId w:val="9"/>
   </w:num>
-  <w:num w:numId="4" w16cid:durableId="1543901249">
+  <w:num w:numId="7">
+    <w:abstractNumId w:val="5"/>
+  </w:num>
+  <w:num w:numId="8">
+    <w:abstractNumId w:val="8"/>
+  </w:num>
+  <w:num w:numId="9">
     <w:abstractNumId w:val="12"/>
   </w:num>
-  <w:num w:numId="5" w16cid:durableId="115224563">
-    <w:abstractNumId w:val="9"/>
+  <w:num w:numId="10">
+    <w:abstractNumId w:val="27"/>
   </w:num>
-  <w:num w:numId="6" w16cid:durableId="1201670216">
-    <w:abstractNumId w:val="8"/>
+  <w:num w:numId="11">
+    <w:abstractNumId w:val="19"/>
   </w:num>
-  <w:num w:numId="7" w16cid:durableId="236941390">
-    <w:abstractNumId w:val="5"/>
+  <w:num w:numId="12">
+    <w:abstractNumId w:val="1"/>
   </w:num>
-  <w:num w:numId="8" w16cid:durableId="233780535">
+  <w:num w:numId="13">
+    <w:abstractNumId w:val="13"/>
+  </w:num>
+  <w:num w:numId="14">
+    <w:abstractNumId w:val="22"/>
+  </w:num>
+  <w:num w:numId="15">
+    <w:abstractNumId w:val="26"/>
+  </w:num>
+  <w:num w:numId="16">
+    <w:abstractNumId w:val="25"/>
+  </w:num>
+  <w:num w:numId="17">
+    <w:abstractNumId w:val="28"/>
+  </w:num>
+  <w:num w:numId="18">
+    <w:abstractNumId w:val="4"/>
+  </w:num>
+  <w:num w:numId="19">
+    <w:abstractNumId w:val="16"/>
+  </w:num>
+  <w:num w:numId="20">
+    <w:abstractNumId w:val="20"/>
+  </w:num>
+  <w:num w:numId="21">
+    <w:abstractNumId w:val="6"/>
+  </w:num>
+  <w:num w:numId="22">
+    <w:abstractNumId w:val="3"/>
+  </w:num>
+  <w:num w:numId="23">
+    <w:abstractNumId w:val="24"/>
+  </w:num>
+  <w:num w:numId="24">
+    <w:abstractNumId w:val="18"/>
+  </w:num>
+  <w:num w:numId="25">
+    <w:abstractNumId w:val="23"/>
+  </w:num>
+  <w:num w:numId="26">
+    <w:abstractNumId w:val="10"/>
+  </w:num>
+  <w:num w:numId="27">
     <w:abstractNumId w:val="7"/>
   </w:num>
-  <w:num w:numId="9" w16cid:durableId="582225123">
-    <w:abstractNumId w:val="10"/>
-  </w:num>
-  <w:num w:numId="10" w16cid:durableId="1796755495">
-    <w:abstractNumId w:val="22"/>
-  </w:num>
-  <w:num w:numId="11" w16cid:durableId="472331872">
-    <w:abstractNumId w:val="16"/>
-  </w:num>
-  <w:num w:numId="12" w16cid:durableId="324475984">
-    <w:abstractNumId w:val="1"/>
-  </w:num>
-  <w:num w:numId="13" w16cid:durableId="1545020146">
-    <w:abstractNumId w:val="11"/>
-  </w:num>
-  <w:num w:numId="14" w16cid:durableId="1126655990">
-    <w:abstractNumId w:val="18"/>
-  </w:num>
-  <w:num w:numId="15" w16cid:durableId="291132961">
-    <w:abstractNumId w:val="21"/>
-  </w:num>
-  <w:num w:numId="16" w16cid:durableId="233587339">
-    <w:abstractNumId w:val="20"/>
-  </w:num>
-  <w:num w:numId="17" w16cid:durableId="5065302">
-    <w:abstractNumId w:val="23"/>
-  </w:num>
-  <w:num w:numId="18" w16cid:durableId="1701512352">
-    <w:abstractNumId w:val="4"/>
-  </w:num>
-  <w:num w:numId="19" w16cid:durableId="1852141663">
-    <w:abstractNumId w:val="13"/>
-  </w:num>
-  <w:num w:numId="20" w16cid:durableId="1633823818">
-    <w:abstractNumId w:val="17"/>
-  </w:num>
-  <w:num w:numId="21" w16cid:durableId="1683782107">
-    <w:abstractNumId w:val="6"/>
-  </w:num>
-  <w:num w:numId="22" w16cid:durableId="1168522303">
-    <w:abstractNumId w:val="3"/>
-  </w:num>
-  <w:num w:numId="23" w16cid:durableId="1403409673">
-    <w:abstractNumId w:val="19"/>
-  </w:num>
-  <w:num w:numId="24" w16cid:durableId="355424486">
+  <w:num w:numId="28">
     <w:abstractNumId w:val="15"/>
   </w:num>
-  <w:num w:numId="25" w16cid:durableId="1922938004">
-    <w:abstractNumId w:val="24"/>
-  </w:num>
-  <w:num w:numId="26" w16cid:durableId="1287835075">
-    <w:abstractNumId w:val="25"/>
-  </w:num>
-  <w:num w:numId="27" w16cid:durableId="441334097">
-    <w:abstractNumId w:val="26"/>
-  </w:num>
-  <w:num w:numId="28" w16cid:durableId="1462691924">
-    <w:abstractNumId w:val="27"/>
-  </w:num>
-  <w:num w:numId="29" w16cid:durableId="1407311693">
-    <w:abstractNumId w:val="28"/>
+  <w:num w:numId="29">
+    <w:abstractNumId w:val="21"/>
   </w:num>
 </w:numbering>
 </file>
 
 <file path=word/styles.xml><?xml version="1.0" encoding="utf-8"?>
-<w:styles xmlns:mc="http://schemas.openxmlformats.org/markup-compatibility/2006" xmlns:r="http://schemas.openxmlformats.org/officeDocument/2006/relationships" xmlns:w="http://schemas.openxmlformats.org/wordprocessingml/2006/main" xmlns:w14="http://schemas.microsoft.com/office/word/2010/wordml" xmlns:w15="http://schemas.microsoft.com/office/word/2012/wordml" xmlns:w16cex="http://schemas.microsoft.com/office/word/2018/wordml/cex" xmlns:w16cid="http://schemas.microsoft.com/office/word/2016/wordml/cid" xmlns:w16="http://schemas.microsoft.com/office/word/2018/wordml" xmlns:w16du="http://schemas.microsoft.com/office/word/2023/wordml/word16du" xmlns:w16sdtdh="http://schemas.microsoft.com/office/word/2020/wordml/sdtdatahash" xmlns:w16sdtfl="http://schemas.microsoft.com/office/word/2024/wordml/sdtformatlock" xmlns:w16se="http://schemas.microsoft.com/office/word/2015/wordml/symex" mc:Ignorable="w14 w15 w16se w16cid w16 w16cex w16sdtdh w16sdtfl w16du">
+<w:styles xmlns:mc="http://schemas.openxmlformats.org/markup-compatibility/2006" xmlns:r="http://schemas.openxmlformats.org/officeDocument/2006/relationships" xmlns:w="http://schemas.openxmlformats.org/wordprocessingml/2006/main" xmlns:w14="http://schemas.microsoft.com/office/word/2010/wordml" xmlns:w15="http://schemas.microsoft.com/office/word/2012/wordml" xmlns:w16cex="http://schemas.microsoft.com/office/word/2018/wordml/cex" xmlns:w16cid="http://schemas.microsoft.com/office/word/2016/wordml/cid" xmlns:w16="http://schemas.microsoft.com/office/word/2018/wordml" xmlns:w16sdtdh="http://schemas.microsoft.com/office/word/2020/wordml/sdtdatahash" xmlns:w16se="http://schemas.microsoft.com/office/word/2015/wordml/symex" mc:Ignorable="w14 w15 w16se w16cid w16 w16cex w16sdtdh">
   <w:docDefaults>
     <w:rPrDefault>
       <w:rPr>
         <w:rFonts w:ascii="Times New Roman" w:eastAsia="Times New Roman" w:hAnsi="Times New Roman" w:cs="Times New Roman"/>
-        <w:lang w:val="es-GT" w:eastAsia="es-GT" w:bidi="ar-SA"/>
+        <w:lang w:val="es-419" w:eastAsia="es-419" w:bidi="ar-SA"/>
       </w:rPr>
     </w:rPrDefault>
     <w:pPrDefault/>
@@ -6273,7 +6285,7 @@
       <w:lang w:val="es-ES" w:eastAsia="es-ES"/>
     </w:rPr>
   </w:style>
-  <w:style w:type="paragraph" w:styleId="Ttulo1">
+  <w:style w:type="paragraph" w:styleId="Heading1">
     <w:name w:val="heading 1"/>
     <w:basedOn w:val="Normal"/>
     <w:qFormat/>
@@ -6290,7 +6302,7 @@
       <w:szCs w:val="48"/>
     </w:rPr>
   </w:style>
-  <w:style w:type="paragraph" w:styleId="Ttulo2">
+  <w:style w:type="paragraph" w:styleId="Heading2">
     <w:name w:val="heading 2"/>
     <w:basedOn w:val="Normal"/>
     <w:qFormat/>
@@ -6306,13 +6318,13 @@
       <w:szCs w:val="36"/>
     </w:rPr>
   </w:style>
-  <w:style w:type="character" w:default="1" w:styleId="Fuentedeprrafopredeter">
+  <w:style w:type="character" w:default="1" w:styleId="DefaultParagraphFont">
     <w:name w:val="Default Paragraph Font"/>
     <w:uiPriority w:val="1"/>
     <w:semiHidden/>
     <w:unhideWhenUsed/>
   </w:style>
-  <w:style w:type="table" w:default="1" w:styleId="Tablanormal">
+  <w:style w:type="table" w:default="1" w:styleId="TableNormal">
     <w:name w:val="Normal Table"/>
     <w:uiPriority w:val="99"/>
     <w:semiHidden/>
@@ -6327,7 +6339,7 @@
       </w:tblCellMar>
     </w:tblPr>
   </w:style>
-  <w:style w:type="numbering" w:default="1" w:styleId="Sinlista">
+  <w:style w:type="numbering" w:default="1" w:styleId="NoList">
     <w:name w:val="No List"/>
     <w:uiPriority w:val="99"/>
     <w:semiHidden/>
@@ -6341,7 +6353,7 @@
       <w:spacing w:before="100" w:beforeAutospacing="1" w:after="100" w:afterAutospacing="1"/>
     </w:pPr>
   </w:style>
-  <w:style w:type="paragraph" w:styleId="TDC1">
+  <w:style w:type="paragraph" w:styleId="TOC1">
     <w:name w:val="toc 1"/>
     <w:basedOn w:val="Normal"/>
     <w:rsid w:val="000D097C"/>
@@ -6349,7 +6361,7 @@
       <w:spacing w:before="100" w:beforeAutospacing="1" w:after="100" w:afterAutospacing="1"/>
     </w:pPr>
   </w:style>
-  <w:style w:type="character" w:styleId="Hipervnculo">
+  <w:style w:type="character" w:styleId="Hyperlink">
     <w:name w:val="Hyperlink"/>
     <w:rsid w:val="000D097C"/>
     <w:rPr>
@@ -6357,7 +6369,7 @@
       <w:u w:val="single"/>
     </w:rPr>
   </w:style>
-  <w:style w:type="paragraph" w:styleId="TDC2">
+  <w:style w:type="paragraph" w:styleId="TOC2">
     <w:name w:val="toc 2"/>
     <w:basedOn w:val="Normal"/>
     <w:rsid w:val="000D097C"/>
@@ -6365,7 +6377,7 @@
       <w:spacing w:before="100" w:beforeAutospacing="1" w:after="100" w:afterAutospacing="1"/>
     </w:pPr>
   </w:style>
-  <w:style w:type="paragraph" w:styleId="Sangra3detindependiente">
+  <w:style w:type="paragraph" w:styleId="BodyTextIndent3">
     <w:name w:val="Body Text Indent 3"/>
     <w:basedOn w:val="Normal"/>
     <w:rsid w:val="000D097C"/>
@@ -6373,10 +6385,10 @@
       <w:spacing w:before="100" w:beforeAutospacing="1" w:after="100" w:afterAutospacing="1"/>
     </w:pPr>
   </w:style>
-  <w:style w:type="paragraph" w:styleId="Encabezado">
+  <w:style w:type="paragraph" w:styleId="Header">
     <w:name w:val="header"/>
     <w:basedOn w:val="Normal"/>
-    <w:link w:val="EncabezadoCar"/>
+    <w:link w:val="HeaderChar"/>
     <w:uiPriority w:val="99"/>
     <w:rsid w:val="000D097C"/>
     <w:pPr>
@@ -6393,16 +6405,16 @@
   </w:style>
   <w:style w:type="paragraph" w:customStyle="1" w:styleId="ByLine">
     <w:name w:val="ByLine"/>
-    <w:basedOn w:val="Ttulo"/>
+    <w:basedOn w:val="Title"/>
     <w:rsid w:val="00F6349F"/>
     <w:rPr>
       <w:sz w:val="28"/>
     </w:rPr>
   </w:style>
-  <w:style w:type="paragraph" w:styleId="Ttulo">
+  <w:style w:type="paragraph" w:styleId="Title">
     <w:name w:val="Title"/>
     <w:basedOn w:val="Normal"/>
-    <w:link w:val="TtuloCar"/>
+    <w:link w:val="TitleChar"/>
     <w:qFormat/>
     <w:rsid w:val="00F6349F"/>
     <w:pPr>
@@ -6418,9 +6430,9 @@
       <w:lang w:val="en-US" w:eastAsia="en-US"/>
     </w:rPr>
   </w:style>
-  <w:style w:type="character" w:customStyle="1" w:styleId="TtuloCar">
-    <w:name w:val="Título Car"/>
-    <w:link w:val="Ttulo"/>
+  <w:style w:type="character" w:customStyle="1" w:styleId="TitleChar">
+    <w:name w:val="Title Char"/>
+    <w:link w:val="Title"/>
     <w:rsid w:val="00F6349F"/>
     <w:rPr>
       <w:rFonts w:ascii="Arial" w:hAnsi="Arial"/>
@@ -6447,12 +6459,12 @@
       <w:lang w:val="en-US" w:eastAsia="en-US"/>
     </w:rPr>
   </w:style>
-  <w:style w:type="character" w:styleId="Nmerodelnea">
+  <w:style w:type="character" w:styleId="LineNumber">
     <w:name w:val="line number"/>
-    <w:basedOn w:val="Fuentedeprrafopredeter"/>
+    <w:basedOn w:val="DefaultParagraphFont"/>
     <w:rsid w:val="008F2F81"/>
   </w:style>
-  <w:style w:type="paragraph" w:styleId="Prrafodelista">
+  <w:style w:type="paragraph" w:styleId="ListParagraph">
     <w:name w:val="List Paragraph"/>
     <w:basedOn w:val="Normal"/>
     <w:uiPriority w:val="34"/>
@@ -6462,10 +6474,10 @@
       <w:ind w:left="708"/>
     </w:pPr>
   </w:style>
-  <w:style w:type="paragraph" w:styleId="Piedepgina">
+  <w:style w:type="paragraph" w:styleId="Footer">
     <w:name w:val="footer"/>
     <w:basedOn w:val="Normal"/>
-    <w:link w:val="PiedepginaCar"/>
+    <w:link w:val="FooterChar"/>
     <w:uiPriority w:val="99"/>
     <w:rsid w:val="00344F2B"/>
     <w:pPr>
@@ -6475,9 +6487,9 @@
       </w:tabs>
     </w:pPr>
   </w:style>
-  <w:style w:type="character" w:customStyle="1" w:styleId="PiedepginaCar">
-    <w:name w:val="Pie de página Car"/>
-    <w:link w:val="Piedepgina"/>
+  <w:style w:type="character" w:customStyle="1" w:styleId="FooterChar">
+    <w:name w:val="Footer Char"/>
+    <w:link w:val="Footer"/>
     <w:uiPriority w:val="99"/>
     <w:rsid w:val="00344F2B"/>
     <w:rPr>
@@ -6486,9 +6498,9 @@
       <w:lang w:val="es-ES" w:eastAsia="es-ES"/>
     </w:rPr>
   </w:style>
-  <w:style w:type="character" w:customStyle="1" w:styleId="EncabezadoCar">
-    <w:name w:val="Encabezado Car"/>
-    <w:link w:val="Encabezado"/>
+  <w:style w:type="character" w:customStyle="1" w:styleId="HeaderChar">
+    <w:name w:val="Header Char"/>
+    <w:link w:val="Header"/>
     <w:uiPriority w:val="99"/>
     <w:rsid w:val="00344F2B"/>
     <w:rPr>
@@ -6497,10 +6509,10 @@
       <w:lang w:val="es-ES" w:eastAsia="es-ES"/>
     </w:rPr>
   </w:style>
-  <w:style w:type="paragraph" w:styleId="Textodeglobo">
+  <w:style w:type="paragraph" w:styleId="BalloonText">
     <w:name w:val="Balloon Text"/>
     <w:basedOn w:val="Normal"/>
-    <w:link w:val="TextodegloboCar"/>
+    <w:link w:val="BalloonTextChar"/>
     <w:rsid w:val="00344F2B"/>
     <w:rPr>
       <w:rFonts w:ascii="Tahoma" w:hAnsi="Tahoma" w:cs="Tahoma"/>
@@ -6508,9 +6520,9 @@
       <w:szCs w:val="16"/>
     </w:rPr>
   </w:style>
-  <w:style w:type="character" w:customStyle="1" w:styleId="TextodegloboCar">
-    <w:name w:val="Texto de globo Car"/>
-    <w:link w:val="Textodeglobo"/>
+  <w:style w:type="character" w:customStyle="1" w:styleId="BalloonTextChar">
+    <w:name w:val="Balloon Text Char"/>
+    <w:link w:val="BalloonText"/>
     <w:rsid w:val="00344F2B"/>
     <w:rPr>
       <w:rFonts w:ascii="Tahoma" w:hAnsi="Tahoma" w:cs="Tahoma"/>
@@ -6519,18 +6531,18 @@
       <w:lang w:val="es-ES" w:eastAsia="es-ES"/>
     </w:rPr>
   </w:style>
-  <w:style w:type="paragraph" w:styleId="Textoindependiente">
+  <w:style w:type="paragraph" w:styleId="BodyText">
     <w:name w:val="Body Text"/>
     <w:basedOn w:val="Normal"/>
-    <w:link w:val="TextoindependienteCar"/>
+    <w:link w:val="BodyTextChar"/>
     <w:rsid w:val="00FF438A"/>
     <w:pPr>
       <w:spacing w:after="120"/>
     </w:pPr>
   </w:style>
-  <w:style w:type="character" w:customStyle="1" w:styleId="TextoindependienteCar">
-    <w:name w:val="Texto independiente Car"/>
-    <w:link w:val="Textoindependiente"/>
+  <w:style w:type="character" w:customStyle="1" w:styleId="BodyTextChar">
+    <w:name w:val="Body Text Char"/>
+    <w:link w:val="BodyText"/>
     <w:rsid w:val="00FF438A"/>
     <w:rPr>
       <w:sz w:val="24"/>
@@ -6538,32 +6550,32 @@
       <w:lang w:val="es-ES" w:eastAsia="es-ES"/>
     </w:rPr>
   </w:style>
-  <w:style w:type="paragraph" w:styleId="Textonotaalfinal">
+  <w:style w:type="paragraph" w:styleId="EndnoteText">
     <w:name w:val="endnote text"/>
     <w:basedOn w:val="Normal"/>
-    <w:link w:val="TextonotaalfinalCar"/>
+    <w:link w:val="EndnoteTextChar"/>
     <w:rsid w:val="00A83ADC"/>
     <w:rPr>
       <w:sz w:val="20"/>
       <w:szCs w:val="20"/>
     </w:rPr>
   </w:style>
-  <w:style w:type="character" w:customStyle="1" w:styleId="TextonotaalfinalCar">
-    <w:name w:val="Texto nota al final Car"/>
-    <w:link w:val="Textonotaalfinal"/>
+  <w:style w:type="character" w:customStyle="1" w:styleId="EndnoteTextChar">
+    <w:name w:val="Endnote Text Char"/>
+    <w:link w:val="EndnoteText"/>
     <w:rsid w:val="00A83ADC"/>
     <w:rPr>
       <w:lang w:val="es-ES" w:eastAsia="es-ES"/>
     </w:rPr>
   </w:style>
-  <w:style w:type="character" w:styleId="Refdenotaalfinal">
+  <w:style w:type="character" w:styleId="EndnoteReference">
     <w:name w:val="endnote reference"/>
     <w:rsid w:val="00A83ADC"/>
     <w:rPr>
       <w:vertAlign w:val="superscript"/>
     </w:rPr>
   </w:style>
-  <w:style w:type="paragraph" w:styleId="Revisin">
+  <w:style w:type="paragraph" w:styleId="Revision">
     <w:name w:val="Revision"/>
     <w:hidden/>
     <w:uiPriority w:val="99"/>
@@ -6575,9 +6587,9 @@
       <w:lang w:val="es-ES" w:eastAsia="es-ES"/>
     </w:rPr>
   </w:style>
-  <w:style w:type="table" w:styleId="Tablaconcuadrcula">
+  <w:style w:type="table" w:styleId="TableGrid">
     <w:name w:val="Table Grid"/>
-    <w:basedOn w:val="Tablanormal"/>
+    <w:basedOn w:val="TableNormal"/>
     <w:uiPriority w:val="1"/>
     <w:rsid w:val="00557FB4"/>
     <w:rPr>

</xml_diff>